<commit_message>
Fix: Add preliminary article placeholder and create placeholder formatter
- Add {{ARTICLE_PRELIMINAIRE}} placeholder to template for conditions suspensives
- Create placeholder_formatter module to preserve formatting when replacing placeholders
- Import placeholder_formatter in bail_word_generator for future use
- This will allow bold placeholders to produce bold replacement text

🤖 Generated with [Claude Code](https://claude.com/claude-code)

Co-Authored-By: Claude <noreply@anthropic.com>
</commit_message>
<xml_diff>
--- a/2025 - Template BAIL.docx
+++ b/2025 - Template BAIL.docx
@@ -391,90 +391,23 @@
         <w:t>{{COMPARUTION_PRENEUR}}</w:t>
       </w:r>
     </w:p>
-    <w:p>
-      <w:pPr>
-        <w:jc w:val="both"/>
-        <w:rPr>
-          <w:rFonts w:ascii="Calibri" w:hAnsi="Calibri" w:cs="Calibri"/>
-          <w:sz w:val="22"/>
-          <w:szCs w:val="22"/>
-        </w:rPr>
-      </w:pPr>
-    </w:p>
-    <w:p>
-      <w:pPr>
-        <w:jc w:val="both"/>
-        <w:rPr>
-          <w:rFonts w:ascii="Calibri" w:hAnsi="Calibri" w:cs="Calibri"/>
-          <w:sz w:val="22"/>
-          <w:szCs w:val="22"/>
-        </w:rPr>
-      </w:pPr>
-    </w:p>
-    <w:p>
-      <w:pPr>
-        <w:jc w:val="both"/>
-        <w:rPr>
-          <w:rFonts w:ascii="Calibri" w:hAnsi="Calibri" w:cs="Calibri"/>
-          <w:b/>
-          <w:bCs/>
-          <w:sz w:val="22"/>
-          <w:szCs w:val="22"/>
-        </w:rPr>
-      </w:pPr>
-      <w:r>
-        <w:rPr>
-          <w:rFonts w:ascii="Calibri" w:hAnsi="Calibri" w:cs="Calibri"/>
-          <w:b/>
-          <w:bCs/>
-          <w:sz w:val="22"/>
-          <w:szCs w:val="22"/>
-        </w:rPr>
-        <w:t>D'AUTRE PART</w:t>
-      </w:r>
-    </w:p>
-    <w:p>
-      <w:pPr>
-        <w:jc w:val="both"/>
-        <w:rPr>
-          <w:rFonts w:ascii="Calibri" w:hAnsi="Calibri" w:cs="Calibri"/>
-          <w:sz w:val="22"/>
-          <w:szCs w:val="22"/>
-        </w:rPr>
-      </w:pPr>
-    </w:p>
-    <w:p>
-      <w:pPr>
-        <w:jc w:val="both"/>
-        <w:rPr>
-          <w:rFonts w:ascii="Calibri" w:hAnsi="Calibri" w:cs="Calibri"/>
-          <w:sz w:val="22"/>
-          <w:szCs w:val="22"/>
-        </w:rPr>
-      </w:pPr>
-      <w:r>
-        <w:rPr>
-          <w:rFonts w:ascii="Calibri" w:hAnsi="Calibri" w:cs="Calibri"/>
-          <w:sz w:val="22"/>
-          <w:szCs w:val="22"/>
-        </w:rPr>
-        <w:t>Ci-après dénommées ensemble</w:t>
-      </w:r>
-      <w:r>
-        <w:rPr>
-          <w:rFonts w:ascii="Calibri" w:hAnsi="Calibri" w:cs="Calibri"/>
-          <w:sz w:val="22"/>
-          <w:szCs w:val="22"/>
-        </w:rPr>
-        <w:t> :</w:t>
-      </w:r>
-      <w:r>
-        <w:rPr>
-          <w:rFonts w:ascii="Calibri" w:hAnsi="Calibri" w:cs="Calibri"/>
-          <w:sz w:val="22"/>
-          <w:szCs w:val="22"/>
-        </w:rPr>
-        <w:t xml:space="preserve"> les « </w:t>
+    <w:p/>
+    <w:p>
+      <w:pPr>
+        <w:jc w:val="both"/>
+        <w:rPr>
+          <w:rFonts w:ascii="Calibri" w:hAnsi="Calibri" w:cs="Calibri"/>
+          <w:sz w:val="22"/>
+          <w:szCs w:val="22"/>
+        </w:rPr>
+      </w:pPr>
+      <w:r>
+        <w:rPr>
+          <w:rFonts w:ascii="Calibri" w:hAnsi="Calibri" w:cs="Calibri"/>
+          <w:sz w:val="22"/>
+          <w:szCs w:val="22"/>
+        </w:rPr>
+        <w:t>Ci-après dénommée : le « </w:t>
       </w:r>
       <w:r>
         <w:rPr>
@@ -485,6 +418,111 @@
           <w:sz w:val="22"/>
           <w:szCs w:val="22"/>
         </w:rPr>
+        <w:t>Preneur</w:t>
+      </w:r>
+      <w:r>
+        <w:rPr>
+          <w:rFonts w:ascii="Calibri" w:hAnsi="Calibri" w:cs="Calibri"/>
+          <w:sz w:val="22"/>
+          <w:szCs w:val="22"/>
+        </w:rPr>
+        <w:t> »</w:t>
+      </w:r>
+    </w:p>
+    <w:p>
+      <w:pPr>
+        <w:jc w:val="both"/>
+        <w:rPr>
+          <w:rFonts w:ascii="Calibri" w:hAnsi="Calibri" w:cs="Calibri"/>
+          <w:sz w:val="22"/>
+          <w:szCs w:val="22"/>
+        </w:rPr>
+      </w:pPr>
+    </w:p>
+    <w:p>
+      <w:pPr>
+        <w:jc w:val="both"/>
+        <w:rPr>
+          <w:rFonts w:ascii="Calibri" w:hAnsi="Calibri" w:cs="Calibri"/>
+          <w:sz w:val="22"/>
+          <w:szCs w:val="22"/>
+        </w:rPr>
+      </w:pPr>
+    </w:p>
+    <w:p>
+      <w:pPr>
+        <w:jc w:val="both"/>
+        <w:rPr>
+          <w:rFonts w:ascii="Calibri" w:hAnsi="Calibri" w:cs="Calibri"/>
+          <w:b/>
+          <w:bCs/>
+          <w:sz w:val="22"/>
+          <w:szCs w:val="22"/>
+        </w:rPr>
+      </w:pPr>
+      <w:r>
+        <w:rPr>
+          <w:rFonts w:ascii="Calibri" w:hAnsi="Calibri" w:cs="Calibri"/>
+          <w:b/>
+          <w:bCs/>
+          <w:sz w:val="22"/>
+          <w:szCs w:val="22"/>
+        </w:rPr>
+        <w:t>D'AUTRE PART</w:t>
+      </w:r>
+    </w:p>
+    <w:p>
+      <w:pPr>
+        <w:jc w:val="both"/>
+        <w:rPr>
+          <w:rFonts w:ascii="Calibri" w:hAnsi="Calibri" w:cs="Calibri"/>
+          <w:sz w:val="22"/>
+          <w:szCs w:val="22"/>
+        </w:rPr>
+      </w:pPr>
+    </w:p>
+    <w:p>
+      <w:pPr>
+        <w:jc w:val="both"/>
+        <w:rPr>
+          <w:rFonts w:ascii="Calibri" w:hAnsi="Calibri" w:cs="Calibri"/>
+          <w:sz w:val="22"/>
+          <w:szCs w:val="22"/>
+        </w:rPr>
+      </w:pPr>
+      <w:r>
+        <w:rPr>
+          <w:rFonts w:ascii="Calibri" w:hAnsi="Calibri" w:cs="Calibri"/>
+          <w:sz w:val="22"/>
+          <w:szCs w:val="22"/>
+        </w:rPr>
+        <w:t>Ci-après dénommées ensemble</w:t>
+      </w:r>
+      <w:r>
+        <w:rPr>
+          <w:rFonts w:ascii="Calibri" w:hAnsi="Calibri" w:cs="Calibri"/>
+          <w:sz w:val="22"/>
+          <w:szCs w:val="22"/>
+        </w:rPr>
+        <w:t> :</w:t>
+      </w:r>
+      <w:r>
+        <w:rPr>
+          <w:rFonts w:ascii="Calibri" w:hAnsi="Calibri" w:cs="Calibri"/>
+          <w:sz w:val="22"/>
+          <w:szCs w:val="22"/>
+        </w:rPr>
+        <w:t xml:space="preserve"> les « </w:t>
+      </w:r>
+      <w:r>
+        <w:rPr>
+          <w:rFonts w:ascii="Calibri" w:hAnsi="Calibri" w:cs="Calibri"/>
+          <w:b/>
+          <w:bCs/>
+          <w:i/>
+          <w:sz w:val="22"/>
+          <w:szCs w:val="22"/>
+        </w:rPr>
         <w:t>Parties</w:t>
       </w:r>
       <w:r>
@@ -495,46 +533,30 @@
         </w:rPr>
         <w:t> ».</w:t>
       </w:r>
-    </w:p>
-    <w:p>
-      <w:pPr>
-        <w:jc w:val="both"/>
-        <w:rPr>
-          <w:rFonts w:ascii="Calibri" w:hAnsi="Calibri" w:cs="Calibri"/>
-          <w:sz w:val="22"/>
-          <w:szCs w:val="22"/>
-        </w:rPr>
-      </w:pPr>
-    </w:p>
-    <w:p>
-      <w:pPr>
-        <w:jc w:val="both"/>
-        <w:rPr>
-          <w:rFonts w:ascii="Calibri" w:hAnsi="Calibri" w:cs="Calibri"/>
-          <w:i/>
-          <w:sz w:val="22"/>
-          <w:szCs w:val="22"/>
-        </w:rPr>
-      </w:pPr>
-    </w:p>
-    <w:p>
-      <w:pPr>
-        <w:pStyle w:val="TM1"/>
-        <w:rPr>
-          <w:noProof/>
-        </w:rPr>
-      </w:pPr>
       <w:r>
         <w:br w:type="page"/>
       </w:r>
       <w:r>
-        <w:lastRenderedPageBreak/>
+        <w:rPr>
+          <w:b/>
+          <w:bCs/>
+          <w:iCs/>
+          <w:sz w:val="24"/>
+          <w:szCs w:val="24"/>
+        </w:rPr>
         <w:fldChar w:fldCharType="begin"/>
       </w:r>
       <w:r>
         <w:instrText xml:space="preserve"> TOC \o "1-3" \h \z \u </w:instrText>
       </w:r>
       <w:r>
+        <w:rPr>
+          <w:b/>
+          <w:bCs/>
+          <w:iCs/>
+          <w:sz w:val="24"/>
+          <w:szCs w:val="24"/>
+        </w:rPr>
         <w:fldChar w:fldCharType="separate"/>
       </w:r>
     </w:p>
@@ -750,6 +772,10 @@
           <w:fldChar w:fldCharType="end"/>
         </w:r>
       </w:hyperlink>
+      <w:r>
+        <w:br/>
+        <w:t>{{ARTICLE_PRELIMINAIRE}}</w:t>
+      </w:r>
     </w:p>
     <w:p>
       <w:pPr>
@@ -6582,6 +6608,7 @@
         </w:rPr>
       </w:pPr>
     </w:p>
+    <w:p/>
     <w:p>
       <w:r>
         <w:t>{{ARTICLE_PRELIMINAIRE}}</w:t>
@@ -7080,7 +7107,6 @@
           <w:sz w:val="22"/>
           <w:szCs w:val="22"/>
         </w:rPr>
-        <w:lastRenderedPageBreak/>
         <w:t>Le</w:t>
       </w:r>
       <w:r>
@@ -7854,7 +7880,6 @@
           <w:sz w:val="22"/>
           <w:szCs w:val="22"/>
         </w:rPr>
-        <w:lastRenderedPageBreak/>
         <w:t xml:space="preserve">Un état des lieux </w:t>
       </w:r>
       <w:r>
@@ -8176,6 +8201,16 @@
         </w:rPr>
         <w:t xml:space="preserve"> :</w:t>
       </w:r>
+    </w:p>
+    <w:p>
+      <w:pPr>
+        <w:jc w:val="both"/>
+        <w:rPr>
+          <w:rFonts w:ascii="Calibri" w:hAnsi="Calibri" w:cs="Calibri"/>
+          <w:sz w:val="22"/>
+          <w:szCs w:val="22"/>
+        </w:rPr>
+      </w:pPr>
     </w:p>
     <w:p>
       <w:pPr>
@@ -9076,8 +9111,8 @@
           <w:szCs w:val="22"/>
         </w:rPr>
       </w:pPr>
-      <w:bookmarkStart w:id="15" w:name="_Hlk117243833"/>
-      <w:bookmarkStart w:id="16" w:name="_Toc176798842"/>
+      <w:bookmarkStart w:id="15" w:name="_Toc176798842"/>
+      <w:bookmarkStart w:id="16" w:name="_Hlk117243833"/>
       <w:r>
         <w:rPr>
           <w:rFonts w:ascii="Calibri" w:hAnsi="Calibri" w:cs="Calibri"/>
@@ -9085,40 +9120,319 @@
           <w:sz w:val="22"/>
           <w:szCs w:val="22"/>
         </w:rPr>
+        <w:t>5.</w:t>
+      </w:r>
+      <w:r>
+        <w:rPr>
+          <w:rFonts w:ascii="Calibri" w:hAnsi="Calibri" w:cs="Calibri"/>
+          <w:b/>
+          <w:sz w:val="22"/>
+          <w:szCs w:val="22"/>
+        </w:rPr>
+        <w:t>4</w:t>
+      </w:r>
+      <w:r>
+        <w:rPr>
+          <w:rFonts w:ascii="Calibri" w:hAnsi="Calibri" w:cs="Calibri"/>
+          <w:b/>
+          <w:sz w:val="22"/>
+          <w:szCs w:val="22"/>
+        </w:rPr>
+        <w:t xml:space="preserve">. – </w:t>
+      </w:r>
+      <w:r>
+        <w:rPr>
+          <w:rFonts w:ascii="Calibri" w:hAnsi="Calibri" w:cs="Calibri"/>
+          <w:b/>
+          <w:sz w:val="22"/>
+          <w:szCs w:val="22"/>
+        </w:rPr>
+        <w:t xml:space="preserve">Travaux du </w:t>
+      </w:r>
+      <w:r>
+        <w:rPr>
+          <w:rFonts w:ascii="Calibri" w:hAnsi="Calibri" w:cs="Calibri"/>
+          <w:b/>
+          <w:sz w:val="22"/>
+          <w:szCs w:val="22"/>
+        </w:rPr>
+        <w:t>Bail</w:t>
+      </w:r>
+      <w:r>
+        <w:rPr>
+          <w:rFonts w:ascii="Calibri" w:hAnsi="Calibri" w:cs="Calibri"/>
+          <w:b/>
+          <w:sz w:val="22"/>
+          <w:szCs w:val="22"/>
+        </w:rPr>
+        <w:t>leur</w:t>
+      </w:r>
+      <w:r>
+        <w:rPr>
+          <w:rFonts w:ascii="Calibri" w:hAnsi="Calibri" w:cs="Calibri"/>
+          <w:b/>
+          <w:sz w:val="22"/>
+          <w:szCs w:val="22"/>
+        </w:rPr>
+        <w:t xml:space="preserve"> dans l’</w:t>
+      </w:r>
+      <w:r>
+        <w:rPr>
+          <w:rFonts w:ascii="Calibri" w:hAnsi="Calibri" w:cs="Calibri"/>
+          <w:b/>
+          <w:sz w:val="22"/>
+          <w:szCs w:val="22"/>
+        </w:rPr>
+        <w:t>Immeuble</w:t>
+      </w:r>
+      <w:r>
+        <w:rPr>
+          <w:rFonts w:ascii="Calibri" w:hAnsi="Calibri" w:cs="Calibri"/>
+          <w:b/>
+          <w:sz w:val="22"/>
+          <w:szCs w:val="22"/>
+        </w:rPr>
+        <w:t xml:space="preserve"> ou les </w:t>
+      </w:r>
+      <w:r>
+        <w:rPr>
+          <w:rFonts w:ascii="Calibri" w:hAnsi="Calibri" w:cs="Calibri"/>
+          <w:b/>
+          <w:sz w:val="22"/>
+          <w:szCs w:val="22"/>
+        </w:rPr>
+        <w:t>Locaux Loués</w:t>
+      </w:r>
+      <w:r>
+        <w:rPr>
+          <w:rFonts w:ascii="Calibri" w:hAnsi="Calibri" w:cs="Calibri"/>
+          <w:b/>
+          <w:sz w:val="22"/>
+          <w:szCs w:val="22"/>
+        </w:rPr>
+        <w:t> :</w:t>
+      </w:r>
+      <w:bookmarkEnd w:id="15"/>
+    </w:p>
+    <w:p>
+      <w:pPr>
+        <w:jc w:val="both"/>
+        <w:rPr>
+          <w:rFonts w:ascii="Calibri" w:hAnsi="Calibri" w:cs="Calibri"/>
+          <w:sz w:val="22"/>
+          <w:szCs w:val="22"/>
+        </w:rPr>
+      </w:pPr>
+    </w:p>
+    <w:p>
+      <w:pPr>
+        <w:jc w:val="both"/>
+        <w:rPr>
+          <w:rFonts w:ascii="Calibri" w:hAnsi="Calibri" w:cs="Calibri"/>
+          <w:sz w:val="22"/>
+          <w:szCs w:val="22"/>
+        </w:rPr>
+      </w:pPr>
+      <w:r>
+        <w:rPr>
+          <w:rFonts w:ascii="Calibri" w:hAnsi="Calibri" w:cs="Calibri"/>
+          <w:sz w:val="22"/>
+          <w:szCs w:val="22"/>
+        </w:rPr>
+        <w:t xml:space="preserve">Le </w:t>
+      </w:r>
+      <w:r>
+        <w:rPr>
+          <w:rFonts w:ascii="Calibri" w:hAnsi="Calibri" w:cs="Calibri"/>
+          <w:sz w:val="22"/>
+          <w:szCs w:val="22"/>
+        </w:rPr>
+        <w:t>P</w:t>
+      </w:r>
+      <w:r>
+        <w:rPr>
+          <w:rFonts w:ascii="Calibri" w:hAnsi="Calibri" w:cs="Calibri"/>
+          <w:sz w:val="22"/>
+          <w:szCs w:val="22"/>
+        </w:rPr>
+        <w:t>reneur</w:t>
+      </w:r>
+      <w:r>
+        <w:rPr>
+          <w:rFonts w:ascii="Calibri" w:hAnsi="Calibri" w:cs="Calibri"/>
+          <w:sz w:val="22"/>
+          <w:szCs w:val="22"/>
+        </w:rPr>
+        <w:t xml:space="preserve"> devra souffrir et laisser faire, sans pouvoir prétendre à aucune indemnité ni diminution de lo</w:t>
+      </w:r>
+      <w:r>
+        <w:rPr>
+          <w:rFonts w:ascii="Calibri" w:hAnsi="Calibri" w:cs="Calibri"/>
+          <w:sz w:val="22"/>
+          <w:szCs w:val="22"/>
+        </w:rPr>
+        <w:t>yer, tous travaux de réparation</w:t>
+      </w:r>
+      <w:r>
+        <w:rPr>
+          <w:rFonts w:ascii="Calibri" w:hAnsi="Calibri" w:cs="Calibri"/>
+          <w:sz w:val="22"/>
+          <w:szCs w:val="22"/>
+        </w:rPr>
+        <w:t>,</w:t>
+      </w:r>
+      <w:r>
+        <w:rPr>
+          <w:rFonts w:ascii="Calibri" w:hAnsi="Calibri" w:cs="Calibri"/>
+          <w:sz w:val="22"/>
+          <w:szCs w:val="22"/>
+        </w:rPr>
+        <w:t xml:space="preserve"> remplacement,</w:t>
+      </w:r>
+      <w:r>
+        <w:rPr>
+          <w:rFonts w:ascii="Calibri" w:hAnsi="Calibri" w:cs="Calibri"/>
+          <w:sz w:val="22"/>
+          <w:szCs w:val="22"/>
+        </w:rPr>
+        <w:t xml:space="preserve"> ravalement, réfection, rénovation, modification que le </w:t>
+      </w:r>
+      <w:r>
+        <w:rPr>
+          <w:rFonts w:ascii="Calibri" w:hAnsi="Calibri" w:cs="Calibri"/>
+          <w:sz w:val="22"/>
+          <w:szCs w:val="22"/>
+        </w:rPr>
+        <w:t>Bail</w:t>
+      </w:r>
+      <w:r>
+        <w:rPr>
+          <w:rFonts w:ascii="Calibri" w:hAnsi="Calibri" w:cs="Calibri"/>
+          <w:sz w:val="22"/>
+          <w:szCs w:val="22"/>
+        </w:rPr>
+        <w:t>leur</w:t>
+      </w:r>
+      <w:r>
+        <w:rPr>
+          <w:rFonts w:ascii="Calibri" w:hAnsi="Calibri" w:cs="Calibri"/>
+          <w:sz w:val="22"/>
+          <w:szCs w:val="22"/>
+        </w:rPr>
+        <w:t xml:space="preserve"> et/ou la copropriété jugerait (aient) nécessaires en cours de </w:t>
+      </w:r>
+      <w:r>
+        <w:rPr>
+          <w:rFonts w:ascii="Calibri" w:hAnsi="Calibri" w:cs="Calibri"/>
+          <w:sz w:val="22"/>
+          <w:szCs w:val="22"/>
+        </w:rPr>
+        <w:t>Bail</w:t>
+      </w:r>
+      <w:r>
+        <w:rPr>
+          <w:rFonts w:ascii="Calibri" w:hAnsi="Calibri" w:cs="Calibri"/>
+          <w:sz w:val="22"/>
+          <w:szCs w:val="22"/>
+        </w:rPr>
+        <w:t xml:space="preserve"> dans</w:t>
+      </w:r>
+      <w:r>
+        <w:rPr>
+          <w:rFonts w:ascii="Calibri" w:hAnsi="Calibri" w:cs="Calibri"/>
+          <w:sz w:val="22"/>
+          <w:szCs w:val="22"/>
+        </w:rPr>
+        <w:t xml:space="preserve"> et sur</w:t>
+      </w:r>
+      <w:r>
+        <w:rPr>
+          <w:rFonts w:ascii="Calibri" w:hAnsi="Calibri" w:cs="Calibri"/>
+          <w:sz w:val="22"/>
+          <w:szCs w:val="22"/>
+        </w:rPr>
+        <w:t xml:space="preserve"> l’</w:t>
+      </w:r>
+      <w:r>
+        <w:rPr>
+          <w:rFonts w:ascii="Calibri" w:hAnsi="Calibri" w:cs="Calibri"/>
+          <w:sz w:val="22"/>
+          <w:szCs w:val="22"/>
+        </w:rPr>
+        <w:t>Immeuble</w:t>
+      </w:r>
+      <w:r>
+        <w:rPr>
+          <w:rFonts w:ascii="Calibri" w:hAnsi="Calibri" w:cs="Calibri"/>
+          <w:sz w:val="22"/>
+          <w:szCs w:val="22"/>
+        </w:rPr>
+        <w:t xml:space="preserve">, quelles qu’en soient la nature et la durée, cette dernière excédât-elle </w:t>
+      </w:r>
+      <w:r>
+        <w:rPr>
+          <w:rFonts w:ascii="Calibri" w:hAnsi="Calibri" w:cs="Calibri"/>
+          <w:sz w:val="22"/>
+          <w:szCs w:val="22"/>
+        </w:rPr>
+        <w:t>vingt et un</w:t>
+      </w:r>
+      <w:r>
+        <w:rPr>
+          <w:rFonts w:ascii="Calibri" w:hAnsi="Calibri" w:cs="Calibri"/>
+          <w:sz w:val="22"/>
+          <w:szCs w:val="22"/>
+        </w:rPr>
+        <w:t xml:space="preserve"> jours</w:t>
+      </w:r>
+      <w:r>
+        <w:rPr>
+          <w:rFonts w:ascii="Calibri" w:hAnsi="Calibri" w:cs="Calibri"/>
+          <w:sz w:val="22"/>
+          <w:szCs w:val="22"/>
+        </w:rPr>
+        <w:t xml:space="preserve"> et ce, par dérogation expresse à l’article 1724 du Code civil</w:t>
+      </w:r>
+      <w:r>
+        <w:rPr>
+          <w:rFonts w:ascii="Calibri" w:hAnsi="Calibri" w:cs="Calibri"/>
+          <w:sz w:val="22"/>
+          <w:szCs w:val="22"/>
+        </w:rPr>
+        <w:t>.</w:t>
+      </w:r>
+    </w:p>
+    <w:p>
+      <w:pPr>
+        <w:jc w:val="both"/>
+        <w:rPr>
+          <w:rFonts w:ascii="Calibri" w:hAnsi="Calibri" w:cs="Calibri"/>
+          <w:sz w:val="22"/>
+          <w:szCs w:val="22"/>
+        </w:rPr>
+      </w:pPr>
+    </w:p>
+    <w:p>
+      <w:pPr>
+        <w:jc w:val="both"/>
+        <w:rPr>
+          <w:rFonts w:ascii="Calibri" w:hAnsi="Calibri" w:cs="Calibri"/>
+          <w:sz w:val="22"/>
+          <w:szCs w:val="22"/>
+        </w:rPr>
+      </w:pPr>
+      <w:r>
+        <w:rPr>
+          <w:rFonts w:ascii="Calibri" w:hAnsi="Calibri" w:cs="Calibri"/>
+          <w:sz w:val="22"/>
+          <w:szCs w:val="22"/>
+        </w:rPr>
         <w:lastRenderedPageBreak/>
-        <w:t>5.</w:t>
-      </w:r>
-      <w:r>
-        <w:rPr>
-          <w:rFonts w:ascii="Calibri" w:hAnsi="Calibri" w:cs="Calibri"/>
-          <w:b/>
-          <w:sz w:val="22"/>
-          <w:szCs w:val="22"/>
-        </w:rPr>
-        <w:t>4</w:t>
-      </w:r>
-      <w:r>
-        <w:rPr>
-          <w:rFonts w:ascii="Calibri" w:hAnsi="Calibri" w:cs="Calibri"/>
-          <w:b/>
-          <w:sz w:val="22"/>
-          <w:szCs w:val="22"/>
-        </w:rPr>
-        <w:t xml:space="preserve">. – </w:t>
-      </w:r>
-      <w:r>
-        <w:rPr>
-          <w:rFonts w:ascii="Calibri" w:hAnsi="Calibri" w:cs="Calibri"/>
-          <w:b/>
-          <w:sz w:val="22"/>
-          <w:szCs w:val="22"/>
-        </w:rPr>
-        <w:t xml:space="preserve">Travaux du </w:t>
-      </w:r>
-      <w:r>
-        <w:rPr>
-          <w:rFonts w:ascii="Calibri" w:hAnsi="Calibri" w:cs="Calibri"/>
-          <w:b/>
+        <w:t xml:space="preserve">En outre, le </w:t>
+      </w:r>
+      <w:r>
+        <w:rPr>
+          <w:rFonts w:ascii="Calibri" w:hAnsi="Calibri" w:cs="Calibri"/>
           <w:sz w:val="22"/>
           <w:szCs w:val="22"/>
         </w:rPr>
@@ -9127,7 +9441,6 @@
       <w:r>
         <w:rPr>
           <w:rFonts w:ascii="Calibri" w:hAnsi="Calibri" w:cs="Calibri"/>
-          <w:b/>
           <w:sz w:val="22"/>
           <w:szCs w:val="22"/>
         </w:rPr>
@@ -9136,16 +9449,54 @@
       <w:r>
         <w:rPr>
           <w:rFonts w:ascii="Calibri" w:hAnsi="Calibri" w:cs="Calibri"/>
-          <w:b/>
-          <w:sz w:val="22"/>
-          <w:szCs w:val="22"/>
-        </w:rPr>
-        <w:t xml:space="preserve"> dans l’</w:t>
-      </w:r>
-      <w:r>
-        <w:rPr>
-          <w:rFonts w:ascii="Calibri" w:hAnsi="Calibri" w:cs="Calibri"/>
-          <w:b/>
+          <w:sz w:val="22"/>
+          <w:szCs w:val="22"/>
+        </w:rPr>
+        <w:t xml:space="preserve"> </w:t>
+      </w:r>
+      <w:r>
+        <w:rPr>
+          <w:rFonts w:ascii="Calibri" w:hAnsi="Calibri" w:cs="Calibri"/>
+          <w:sz w:val="22"/>
+          <w:szCs w:val="22"/>
+        </w:rPr>
+        <w:t xml:space="preserve">et/ou </w:t>
+      </w:r>
+      <w:r>
+        <w:rPr>
+          <w:rFonts w:ascii="Calibri" w:hAnsi="Calibri" w:cs="Calibri"/>
+          <w:sz w:val="22"/>
+          <w:szCs w:val="22"/>
+        </w:rPr>
+        <w:t>l’entité en charge de l’Immeuble</w:t>
+      </w:r>
+      <w:r>
+        <w:rPr>
+          <w:rFonts w:ascii="Calibri" w:hAnsi="Calibri" w:cs="Calibri"/>
+          <w:sz w:val="22"/>
+          <w:szCs w:val="22"/>
+        </w:rPr>
+        <w:t xml:space="preserve"> </w:t>
+      </w:r>
+      <w:r>
+        <w:rPr>
+          <w:rFonts w:ascii="Calibri" w:hAnsi="Calibri" w:cs="Calibri"/>
+          <w:sz w:val="22"/>
+          <w:szCs w:val="22"/>
+        </w:rPr>
+        <w:t>s</w:t>
+      </w:r>
+      <w:r>
+        <w:rPr>
+          <w:rFonts w:ascii="Calibri" w:hAnsi="Calibri" w:cs="Calibri"/>
+          <w:sz w:val="22"/>
+          <w:szCs w:val="22"/>
+        </w:rPr>
+        <w:t>e réserve la faculté d’apporter toute modification qu’il lui plaira à l’aspect intérieur ou extérieur de l’</w:t>
+      </w:r>
+      <w:r>
+        <w:rPr>
+          <w:rFonts w:ascii="Calibri" w:hAnsi="Calibri" w:cs="Calibri"/>
           <w:sz w:val="22"/>
           <w:szCs w:val="22"/>
         </w:rPr>
@@ -9154,16 +9505,310 @@
       <w:r>
         <w:rPr>
           <w:rFonts w:ascii="Calibri" w:hAnsi="Calibri" w:cs="Calibri"/>
-          <w:b/>
-          <w:sz w:val="22"/>
-          <w:szCs w:val="22"/>
-        </w:rPr>
-        <w:t xml:space="preserve"> ou les </w:t>
-      </w:r>
-      <w:r>
-        <w:rPr>
-          <w:rFonts w:ascii="Calibri" w:hAnsi="Calibri" w:cs="Calibri"/>
-          <w:b/>
+          <w:sz w:val="22"/>
+          <w:szCs w:val="22"/>
+        </w:rPr>
+        <w:t xml:space="preserve">, soit par des démolitions de bâtiments, soit par l’édification de constructions nouvelles, soit par tous travaux de modification des </w:t>
+      </w:r>
+      <w:r>
+        <w:rPr>
+          <w:rFonts w:ascii="Calibri" w:hAnsi="Calibri" w:cs="Calibri"/>
+          <w:sz w:val="22"/>
+          <w:szCs w:val="22"/>
+        </w:rPr>
+        <w:t>Parties Communes</w:t>
+      </w:r>
+      <w:r>
+        <w:rPr>
+          <w:rFonts w:ascii="Calibri" w:hAnsi="Calibri" w:cs="Calibri"/>
+          <w:sz w:val="22"/>
+          <w:szCs w:val="22"/>
+        </w:rPr>
+        <w:t xml:space="preserve"> ou à usage collectif, sans que le </w:t>
+      </w:r>
+      <w:r>
+        <w:rPr>
+          <w:rFonts w:ascii="Calibri" w:hAnsi="Calibri" w:cs="Calibri"/>
+          <w:sz w:val="22"/>
+          <w:szCs w:val="22"/>
+        </w:rPr>
+        <w:t>Preneur</w:t>
+      </w:r>
+      <w:r>
+        <w:rPr>
+          <w:rFonts w:ascii="Calibri" w:hAnsi="Calibri" w:cs="Calibri"/>
+          <w:sz w:val="22"/>
+          <w:szCs w:val="22"/>
+        </w:rPr>
+        <w:t xml:space="preserve"> ne puisse s’opposer à ces travaux.</w:t>
+      </w:r>
+    </w:p>
+    <w:p>
+      <w:pPr>
+        <w:jc w:val="both"/>
+        <w:rPr>
+          <w:rFonts w:ascii="Calibri" w:hAnsi="Calibri" w:cs="Calibri"/>
+          <w:sz w:val="22"/>
+          <w:szCs w:val="22"/>
+        </w:rPr>
+      </w:pPr>
+    </w:p>
+    <w:p>
+      <w:pPr>
+        <w:jc w:val="both"/>
+        <w:rPr>
+          <w:rFonts w:ascii="Calibri" w:hAnsi="Calibri" w:cs="Calibri"/>
+          <w:sz w:val="22"/>
+          <w:szCs w:val="22"/>
+        </w:rPr>
+      </w:pPr>
+      <w:r>
+        <w:rPr>
+          <w:rFonts w:ascii="Calibri" w:hAnsi="Calibri" w:cs="Calibri"/>
+          <w:sz w:val="22"/>
+          <w:szCs w:val="22"/>
+        </w:rPr>
+        <w:t xml:space="preserve">Le </w:t>
+      </w:r>
+      <w:r>
+        <w:rPr>
+          <w:rFonts w:ascii="Calibri" w:hAnsi="Calibri" w:cs="Calibri"/>
+          <w:sz w:val="22"/>
+          <w:szCs w:val="22"/>
+        </w:rPr>
+        <w:t>Preneur</w:t>
+      </w:r>
+      <w:r>
+        <w:rPr>
+          <w:rFonts w:ascii="Calibri" w:hAnsi="Calibri" w:cs="Calibri"/>
+          <w:sz w:val="22"/>
+          <w:szCs w:val="22"/>
+        </w:rPr>
+        <w:t xml:space="preserve"> s’engage à supporter de la même manière les travaux qui seraient exécutés sur la voie publique ou dans les </w:t>
+      </w:r>
+      <w:r>
+        <w:rPr>
+          <w:rFonts w:ascii="Calibri" w:hAnsi="Calibri" w:cs="Calibri"/>
+          <w:sz w:val="22"/>
+          <w:szCs w:val="22"/>
+        </w:rPr>
+        <w:t>i</w:t>
+      </w:r>
+      <w:r>
+        <w:rPr>
+          <w:rFonts w:ascii="Calibri" w:hAnsi="Calibri" w:cs="Calibri"/>
+          <w:sz w:val="22"/>
+          <w:szCs w:val="22"/>
+        </w:rPr>
+        <w:t>mmeuble</w:t>
+      </w:r>
+      <w:r>
+        <w:rPr>
+          <w:rFonts w:ascii="Calibri" w:hAnsi="Calibri" w:cs="Calibri"/>
+          <w:sz w:val="22"/>
+          <w:szCs w:val="22"/>
+        </w:rPr>
+        <w:t xml:space="preserve">s voisins, alors même qu’il en résulterait une gêne pour la jouissance des </w:t>
+      </w:r>
+      <w:r>
+        <w:rPr>
+          <w:rFonts w:ascii="Calibri" w:hAnsi="Calibri" w:cs="Calibri"/>
+          <w:sz w:val="22"/>
+          <w:szCs w:val="22"/>
+        </w:rPr>
+        <w:t>L</w:t>
+      </w:r>
+      <w:r>
+        <w:rPr>
+          <w:rFonts w:ascii="Calibri" w:hAnsi="Calibri" w:cs="Calibri"/>
+          <w:sz w:val="22"/>
+          <w:szCs w:val="22"/>
+        </w:rPr>
+        <w:t>ocaux</w:t>
+      </w:r>
+      <w:r>
+        <w:rPr>
+          <w:rFonts w:ascii="Calibri" w:hAnsi="Calibri" w:cs="Calibri"/>
+          <w:sz w:val="22"/>
+          <w:szCs w:val="22"/>
+        </w:rPr>
+        <w:t xml:space="preserve"> Loués</w:t>
+      </w:r>
+      <w:r>
+        <w:rPr>
+          <w:rFonts w:ascii="Calibri" w:hAnsi="Calibri" w:cs="Calibri"/>
+          <w:sz w:val="22"/>
+          <w:szCs w:val="22"/>
+        </w:rPr>
+        <w:t xml:space="preserve"> et quand bien même la durée de ces travaux excèderait </w:t>
+      </w:r>
+      <w:r>
+        <w:rPr>
+          <w:rFonts w:ascii="Calibri" w:hAnsi="Calibri" w:cs="Calibri"/>
+          <w:sz w:val="22"/>
+          <w:szCs w:val="22"/>
+        </w:rPr>
+        <w:t>vingt et un</w:t>
+      </w:r>
+      <w:r>
+        <w:rPr>
+          <w:rFonts w:ascii="Calibri" w:hAnsi="Calibri" w:cs="Calibri"/>
+          <w:sz w:val="22"/>
+          <w:szCs w:val="22"/>
+        </w:rPr>
+        <w:t xml:space="preserve"> jours, sauf à exercer personnellement un recours </w:t>
+      </w:r>
+      <w:r>
+        <w:rPr>
+          <w:rFonts w:ascii="Calibri" w:hAnsi="Calibri" w:cs="Calibri"/>
+          <w:sz w:val="22"/>
+          <w:szCs w:val="22"/>
+        </w:rPr>
+        <w:t>contre l’Administration, l’entre</w:t>
+      </w:r>
+      <w:r>
+        <w:rPr>
+          <w:rFonts w:ascii="Calibri" w:hAnsi="Calibri" w:cs="Calibri"/>
+          <w:sz w:val="22"/>
+          <w:szCs w:val="22"/>
+        </w:rPr>
+        <w:t>p</w:t>
+      </w:r>
+      <w:r>
+        <w:rPr>
+          <w:rFonts w:ascii="Calibri" w:hAnsi="Calibri" w:cs="Calibri"/>
+          <w:sz w:val="22"/>
+          <w:szCs w:val="22"/>
+        </w:rPr>
+        <w:t>reneur</w:t>
+      </w:r>
+      <w:r>
+        <w:rPr>
+          <w:rFonts w:ascii="Calibri" w:hAnsi="Calibri" w:cs="Calibri"/>
+          <w:sz w:val="22"/>
+          <w:szCs w:val="22"/>
+        </w:rPr>
+        <w:t xml:space="preserve"> de travaux ou les propriétaires voisins, sans que le </w:t>
+      </w:r>
+      <w:r>
+        <w:rPr>
+          <w:rFonts w:ascii="Calibri" w:hAnsi="Calibri" w:cs="Calibri"/>
+          <w:sz w:val="22"/>
+          <w:szCs w:val="22"/>
+        </w:rPr>
+        <w:t>Bail</w:t>
+      </w:r>
+      <w:r>
+        <w:rPr>
+          <w:rFonts w:ascii="Calibri" w:hAnsi="Calibri" w:cs="Calibri"/>
+          <w:sz w:val="22"/>
+          <w:szCs w:val="22"/>
+        </w:rPr>
+        <w:t>leur</w:t>
+      </w:r>
+      <w:r>
+        <w:rPr>
+          <w:rFonts w:ascii="Calibri" w:hAnsi="Calibri" w:cs="Calibri"/>
+          <w:sz w:val="22"/>
+          <w:szCs w:val="22"/>
+        </w:rPr>
+        <w:t xml:space="preserve"> ne soit jamais ni recherché ni inquiété à ce sujet.</w:t>
+      </w:r>
+    </w:p>
+    <w:p>
+      <w:pPr>
+        <w:jc w:val="both"/>
+        <w:rPr>
+          <w:rFonts w:ascii="Calibri" w:hAnsi="Calibri" w:cs="Calibri"/>
+          <w:sz w:val="22"/>
+          <w:szCs w:val="22"/>
+        </w:rPr>
+      </w:pPr>
+    </w:p>
+    <w:p>
+      <w:pPr>
+        <w:jc w:val="both"/>
+        <w:rPr>
+          <w:rFonts w:ascii="Calibri" w:hAnsi="Calibri" w:cs="Calibri"/>
+          <w:sz w:val="22"/>
+          <w:szCs w:val="22"/>
+        </w:rPr>
+      </w:pPr>
+      <w:r>
+        <w:rPr>
+          <w:rFonts w:ascii="Calibri" w:hAnsi="Calibri" w:cs="Calibri"/>
+          <w:sz w:val="22"/>
+          <w:szCs w:val="22"/>
+        </w:rPr>
+        <w:t xml:space="preserve">Le </w:t>
+      </w:r>
+      <w:r>
+        <w:rPr>
+          <w:rFonts w:ascii="Calibri" w:hAnsi="Calibri" w:cs="Calibri"/>
+          <w:sz w:val="22"/>
+          <w:szCs w:val="22"/>
+        </w:rPr>
+        <w:t>Bail</w:t>
+      </w:r>
+      <w:r>
+        <w:rPr>
+          <w:rFonts w:ascii="Calibri" w:hAnsi="Calibri" w:cs="Calibri"/>
+          <w:sz w:val="22"/>
+          <w:szCs w:val="22"/>
+        </w:rPr>
+        <w:t>leur</w:t>
+      </w:r>
+      <w:r>
+        <w:rPr>
+          <w:rFonts w:ascii="Calibri" w:hAnsi="Calibri" w:cs="Calibri"/>
+          <w:sz w:val="22"/>
+          <w:szCs w:val="22"/>
+        </w:rPr>
+        <w:t xml:space="preserve"> et/ou </w:t>
+      </w:r>
+      <w:r>
+        <w:rPr>
+          <w:rFonts w:ascii="Calibri" w:hAnsi="Calibri" w:cs="Calibri"/>
+          <w:sz w:val="22"/>
+          <w:szCs w:val="22"/>
+        </w:rPr>
+        <w:t>l’entité en charge de l’Immeuble</w:t>
+      </w:r>
+      <w:r>
+        <w:rPr>
+          <w:rFonts w:ascii="Calibri" w:hAnsi="Calibri" w:cs="Calibri"/>
+          <w:sz w:val="22"/>
+          <w:szCs w:val="22"/>
+        </w:rPr>
+        <w:t xml:space="preserve"> </w:t>
+      </w:r>
+      <w:r>
+        <w:rPr>
+          <w:rFonts w:ascii="Calibri" w:hAnsi="Calibri" w:cs="Calibri"/>
+          <w:sz w:val="22"/>
+          <w:szCs w:val="22"/>
+        </w:rPr>
+        <w:t>aura le droit d’installer, entretenir, utiliser, réparer, remplacer les tubes, conduites, câbles, fils et équipements de toute nature pouvant même desservir d’autres parties de l’</w:t>
+      </w:r>
+      <w:r>
+        <w:rPr>
+          <w:rFonts w:ascii="Calibri" w:hAnsi="Calibri" w:cs="Calibri"/>
+          <w:sz w:val="22"/>
+          <w:szCs w:val="22"/>
+        </w:rPr>
+        <w:t>Immeuble</w:t>
+      </w:r>
+      <w:r>
+        <w:rPr>
+          <w:rFonts w:ascii="Calibri" w:hAnsi="Calibri" w:cs="Calibri"/>
+          <w:sz w:val="22"/>
+          <w:szCs w:val="22"/>
+        </w:rPr>
+        <w:t xml:space="preserve"> et qui traversent les </w:t>
+      </w:r>
+      <w:r>
+        <w:rPr>
+          <w:rFonts w:ascii="Calibri" w:hAnsi="Calibri" w:cs="Calibri"/>
           <w:sz w:val="22"/>
           <w:szCs w:val="22"/>
         </w:rPr>
@@ -9172,870 +9817,260 @@
       <w:r>
         <w:rPr>
           <w:rFonts w:ascii="Calibri" w:hAnsi="Calibri" w:cs="Calibri"/>
-          <w:b/>
-          <w:sz w:val="22"/>
-          <w:szCs w:val="22"/>
-        </w:rPr>
-        <w:t> :</w:t>
+          <w:sz w:val="22"/>
+          <w:szCs w:val="22"/>
+        </w:rPr>
+        <w:t xml:space="preserve">, le Preneur ne pouvant en </w:t>
+      </w:r>
+      <w:r>
+        <w:rPr>
+          <w:rFonts w:ascii="Calibri" w:hAnsi="Calibri" w:cs="Calibri"/>
+          <w:sz w:val="22"/>
+          <w:szCs w:val="22"/>
+        </w:rPr>
+        <w:t>interdire</w:t>
+      </w:r>
+      <w:r>
+        <w:rPr>
+          <w:rFonts w:ascii="Calibri" w:hAnsi="Calibri" w:cs="Calibri"/>
+          <w:sz w:val="22"/>
+          <w:szCs w:val="22"/>
+        </w:rPr>
+        <w:t xml:space="preserve"> l’accès</w:t>
+      </w:r>
+      <w:r>
+        <w:rPr>
+          <w:rFonts w:ascii="Calibri" w:hAnsi="Calibri" w:cs="Calibri"/>
+          <w:sz w:val="22"/>
+          <w:szCs w:val="22"/>
+        </w:rPr>
+        <w:t>.</w:t>
+      </w:r>
+    </w:p>
+    <w:p>
+      <w:pPr>
+        <w:jc w:val="both"/>
+        <w:rPr>
+          <w:rFonts w:ascii="Calibri" w:hAnsi="Calibri" w:cs="Calibri"/>
+          <w:sz w:val="22"/>
+          <w:szCs w:val="22"/>
+        </w:rPr>
+      </w:pPr>
+    </w:p>
+    <w:p>
+      <w:pPr>
+        <w:jc w:val="both"/>
+        <w:rPr>
+          <w:rFonts w:ascii="Calibri" w:hAnsi="Calibri" w:cs="Calibri"/>
+          <w:sz w:val="22"/>
+          <w:szCs w:val="22"/>
+        </w:rPr>
+      </w:pPr>
+      <w:r>
+        <w:rPr>
+          <w:rFonts w:ascii="Calibri" w:hAnsi="Calibri" w:cs="Calibri"/>
+          <w:sz w:val="22"/>
+          <w:szCs w:val="22"/>
+        </w:rPr>
+        <w:t xml:space="preserve">En conséquence, le </w:t>
+      </w:r>
+      <w:r>
+        <w:rPr>
+          <w:rFonts w:ascii="Calibri" w:hAnsi="Calibri" w:cs="Calibri"/>
+          <w:sz w:val="22"/>
+          <w:szCs w:val="22"/>
+        </w:rPr>
+        <w:t>Preneur</w:t>
+      </w:r>
+      <w:r>
+        <w:rPr>
+          <w:rFonts w:ascii="Calibri" w:hAnsi="Calibri" w:cs="Calibri"/>
+          <w:sz w:val="22"/>
+          <w:szCs w:val="22"/>
+        </w:rPr>
+        <w:t xml:space="preserve"> devra laisser traverser ses locaux par toutes canalisations existantes ou </w:t>
+      </w:r>
+      <w:r>
+        <w:rPr>
+          <w:rFonts w:ascii="Calibri" w:hAnsi="Calibri" w:cs="Calibri"/>
+          <w:sz w:val="22"/>
+          <w:szCs w:val="22"/>
+        </w:rPr>
+        <w:t>futurs nécessaires</w:t>
+      </w:r>
+      <w:r>
+        <w:rPr>
+          <w:rFonts w:ascii="Calibri" w:hAnsi="Calibri" w:cs="Calibri"/>
+          <w:sz w:val="22"/>
+          <w:szCs w:val="22"/>
+        </w:rPr>
+        <w:t xml:space="preserve"> à la desserte de ses locaux, d’autres locaux de l’</w:t>
+      </w:r>
+      <w:r>
+        <w:rPr>
+          <w:rFonts w:ascii="Calibri" w:hAnsi="Calibri" w:cs="Calibri"/>
+          <w:sz w:val="22"/>
+          <w:szCs w:val="22"/>
+        </w:rPr>
+        <w:t>Immeuble</w:t>
+      </w:r>
+      <w:r>
+        <w:rPr>
+          <w:rFonts w:ascii="Calibri" w:hAnsi="Calibri" w:cs="Calibri"/>
+          <w:sz w:val="22"/>
+          <w:szCs w:val="22"/>
+        </w:rPr>
+        <w:t xml:space="preserve"> ou des parties ou éléments d’équipements collectifs ou communs de l’</w:t>
+      </w:r>
+      <w:r>
+        <w:rPr>
+          <w:rFonts w:ascii="Calibri" w:hAnsi="Calibri" w:cs="Calibri"/>
+          <w:sz w:val="22"/>
+          <w:szCs w:val="22"/>
+        </w:rPr>
+        <w:t>Immeuble</w:t>
+      </w:r>
+      <w:r>
+        <w:rPr>
+          <w:rFonts w:ascii="Calibri" w:hAnsi="Calibri" w:cs="Calibri"/>
+          <w:sz w:val="22"/>
+          <w:szCs w:val="22"/>
+        </w:rPr>
+        <w:t>.</w:t>
+      </w:r>
+    </w:p>
+    <w:p>
+      <w:pPr>
+        <w:jc w:val="both"/>
+        <w:rPr>
+          <w:rFonts w:ascii="Calibri" w:hAnsi="Calibri" w:cs="Calibri"/>
+          <w:sz w:val="22"/>
+          <w:szCs w:val="22"/>
+        </w:rPr>
+      </w:pPr>
+    </w:p>
+    <w:p>
+      <w:pPr>
+        <w:jc w:val="both"/>
+        <w:rPr>
+          <w:rFonts w:ascii="Calibri" w:hAnsi="Calibri" w:cs="Calibri"/>
+          <w:sz w:val="22"/>
+          <w:szCs w:val="22"/>
+        </w:rPr>
+      </w:pPr>
+      <w:r>
+        <w:rPr>
+          <w:rFonts w:ascii="Calibri" w:hAnsi="Calibri" w:cs="Calibri"/>
+          <w:sz w:val="22"/>
+          <w:szCs w:val="22"/>
+        </w:rPr>
+        <w:t>Pour répondre aux besoins de ses statistiques, l</w:t>
+      </w:r>
+      <w:r>
+        <w:rPr>
+          <w:rFonts w:ascii="Calibri" w:hAnsi="Calibri" w:cs="Calibri"/>
+          <w:sz w:val="22"/>
+          <w:szCs w:val="22"/>
+        </w:rPr>
+        <w:t xml:space="preserve">e </w:t>
+      </w:r>
+      <w:r>
+        <w:rPr>
+          <w:rFonts w:ascii="Calibri" w:hAnsi="Calibri" w:cs="Calibri"/>
+          <w:sz w:val="22"/>
+          <w:szCs w:val="22"/>
+        </w:rPr>
+        <w:t>Bail</w:t>
+      </w:r>
+      <w:r>
+        <w:rPr>
+          <w:rFonts w:ascii="Calibri" w:hAnsi="Calibri" w:cs="Calibri"/>
+          <w:sz w:val="22"/>
+          <w:szCs w:val="22"/>
+        </w:rPr>
+        <w:t xml:space="preserve">leur se réserve la faculté d’installer à ses frais </w:t>
+      </w:r>
+      <w:r>
+        <w:rPr>
+          <w:rFonts w:ascii="Calibri" w:hAnsi="Calibri" w:cs="Calibri"/>
+          <w:sz w:val="22"/>
+          <w:szCs w:val="22"/>
+        </w:rPr>
+        <w:t xml:space="preserve">à l’entrée des </w:t>
+      </w:r>
+      <w:r>
+        <w:rPr>
+          <w:rFonts w:ascii="Calibri" w:hAnsi="Calibri" w:cs="Calibri"/>
+          <w:sz w:val="22"/>
+          <w:szCs w:val="22"/>
+        </w:rPr>
+        <w:t>Locaux Loués</w:t>
+      </w:r>
+      <w:r>
+        <w:rPr>
+          <w:rFonts w:ascii="Calibri" w:hAnsi="Calibri" w:cs="Calibri"/>
+          <w:sz w:val="22"/>
+          <w:szCs w:val="22"/>
+        </w:rPr>
+        <w:t xml:space="preserve"> </w:t>
+      </w:r>
+      <w:r>
+        <w:rPr>
+          <w:rFonts w:ascii="Calibri" w:hAnsi="Calibri" w:cs="Calibri"/>
+          <w:sz w:val="22"/>
+          <w:szCs w:val="22"/>
+        </w:rPr>
+        <w:t xml:space="preserve">un compteur de flux </w:t>
+      </w:r>
+      <w:r>
+        <w:rPr>
+          <w:rFonts w:ascii="Calibri" w:hAnsi="Calibri" w:cs="Calibri"/>
+          <w:sz w:val="22"/>
+          <w:szCs w:val="22"/>
+        </w:rPr>
+        <w:t>de clientèle dont il gardera la propriété des données collectées</w:t>
+      </w:r>
+      <w:r>
+        <w:rPr>
+          <w:rFonts w:ascii="Calibri" w:hAnsi="Calibri" w:cs="Calibri"/>
+          <w:sz w:val="22"/>
+          <w:szCs w:val="22"/>
+        </w:rPr>
+        <w:t>. Le Bailleur pourra communiquer les données collectées au Preneur si celui-ci lui en fait la demande.</w:t>
+      </w:r>
+      <w:r>
+        <w:rPr>
+          <w:rFonts w:ascii="Calibri" w:hAnsi="Calibri" w:cs="Calibri"/>
+          <w:sz w:val="22"/>
+          <w:szCs w:val="22"/>
+        </w:rPr>
+        <w:t xml:space="preserve"> </w:t>
+      </w:r>
+      <w:r>
+        <w:rPr>
+          <w:rFonts w:ascii="Calibri" w:hAnsi="Calibri" w:cs="Calibri"/>
+          <w:sz w:val="22"/>
+          <w:szCs w:val="22"/>
+        </w:rPr>
+        <w:t xml:space="preserve">Le Preneur qui en sera informé par tous moyens, et notamment par courriel, moyennant un préavis d’un mois ne pourra en </w:t>
+      </w:r>
+      <w:r>
+        <w:rPr>
+          <w:rFonts w:ascii="Calibri" w:hAnsi="Calibri" w:cs="Calibri"/>
+          <w:sz w:val="22"/>
+          <w:szCs w:val="22"/>
+        </w:rPr>
+        <w:t>interdire</w:t>
+      </w:r>
+      <w:r>
+        <w:rPr>
+          <w:rFonts w:ascii="Calibri" w:hAnsi="Calibri" w:cs="Calibri"/>
+          <w:sz w:val="22"/>
+          <w:szCs w:val="22"/>
+        </w:rPr>
+        <w:t xml:space="preserve"> la pose.</w:t>
       </w:r>
       <w:bookmarkEnd w:id="16"/>
-    </w:p>
-    <w:p>
-      <w:pPr>
-        <w:jc w:val="both"/>
-        <w:rPr>
-          <w:rFonts w:ascii="Calibri" w:hAnsi="Calibri" w:cs="Calibri"/>
-          <w:sz w:val="22"/>
-          <w:szCs w:val="22"/>
-        </w:rPr>
-      </w:pPr>
-    </w:p>
-    <w:p>
-      <w:pPr>
-        <w:jc w:val="both"/>
-        <w:rPr>
-          <w:rFonts w:ascii="Calibri" w:hAnsi="Calibri" w:cs="Calibri"/>
-          <w:sz w:val="22"/>
-          <w:szCs w:val="22"/>
-        </w:rPr>
-      </w:pPr>
-      <w:r>
-        <w:rPr>
-          <w:rFonts w:ascii="Calibri" w:hAnsi="Calibri" w:cs="Calibri"/>
-          <w:sz w:val="22"/>
-          <w:szCs w:val="22"/>
-        </w:rPr>
-        <w:t xml:space="preserve">Le </w:t>
-      </w:r>
-      <w:r>
-        <w:rPr>
-          <w:rFonts w:ascii="Calibri" w:hAnsi="Calibri" w:cs="Calibri"/>
-          <w:sz w:val="22"/>
-          <w:szCs w:val="22"/>
-        </w:rPr>
-        <w:t>P</w:t>
-      </w:r>
-      <w:r>
-        <w:rPr>
-          <w:rFonts w:ascii="Calibri" w:hAnsi="Calibri" w:cs="Calibri"/>
-          <w:sz w:val="22"/>
-          <w:szCs w:val="22"/>
-        </w:rPr>
-        <w:t>reneur</w:t>
-      </w:r>
-      <w:r>
-        <w:rPr>
-          <w:rFonts w:ascii="Calibri" w:hAnsi="Calibri" w:cs="Calibri"/>
-          <w:sz w:val="22"/>
-          <w:szCs w:val="22"/>
-        </w:rPr>
-        <w:t xml:space="preserve"> devra souffrir et laisser faire, sans pouvoir prétendre à aucune indemnité ni diminution de lo</w:t>
-      </w:r>
-      <w:r>
-        <w:rPr>
-          <w:rFonts w:ascii="Calibri" w:hAnsi="Calibri" w:cs="Calibri"/>
-          <w:sz w:val="22"/>
-          <w:szCs w:val="22"/>
-        </w:rPr>
-        <w:t>yer, tous travaux de réparation</w:t>
-      </w:r>
-      <w:r>
-        <w:rPr>
-          <w:rFonts w:ascii="Calibri" w:hAnsi="Calibri" w:cs="Calibri"/>
-          <w:sz w:val="22"/>
-          <w:szCs w:val="22"/>
-        </w:rPr>
-        <w:t>,</w:t>
-      </w:r>
-      <w:r>
-        <w:rPr>
-          <w:rFonts w:ascii="Calibri" w:hAnsi="Calibri" w:cs="Calibri"/>
-          <w:sz w:val="22"/>
-          <w:szCs w:val="22"/>
-        </w:rPr>
-        <w:t xml:space="preserve"> remplacement,</w:t>
-      </w:r>
-      <w:r>
-        <w:rPr>
-          <w:rFonts w:ascii="Calibri" w:hAnsi="Calibri" w:cs="Calibri"/>
-          <w:sz w:val="22"/>
-          <w:szCs w:val="22"/>
-        </w:rPr>
-        <w:t xml:space="preserve"> ravalement, réfection, rénovation, modification que le </w:t>
-      </w:r>
-      <w:r>
-        <w:rPr>
-          <w:rFonts w:ascii="Calibri" w:hAnsi="Calibri" w:cs="Calibri"/>
-          <w:sz w:val="22"/>
-          <w:szCs w:val="22"/>
-        </w:rPr>
-        <w:t>Bail</w:t>
-      </w:r>
-      <w:r>
-        <w:rPr>
-          <w:rFonts w:ascii="Calibri" w:hAnsi="Calibri" w:cs="Calibri"/>
-          <w:sz w:val="22"/>
-          <w:szCs w:val="22"/>
-        </w:rPr>
-        <w:t>leur</w:t>
-      </w:r>
-      <w:r>
-        <w:rPr>
-          <w:rFonts w:ascii="Calibri" w:hAnsi="Calibri" w:cs="Calibri"/>
-          <w:sz w:val="22"/>
-          <w:szCs w:val="22"/>
-        </w:rPr>
-        <w:t xml:space="preserve"> et/ou la copropriété jugerait (aient) nécessaires en cours de </w:t>
-      </w:r>
-      <w:r>
-        <w:rPr>
-          <w:rFonts w:ascii="Calibri" w:hAnsi="Calibri" w:cs="Calibri"/>
-          <w:sz w:val="22"/>
-          <w:szCs w:val="22"/>
-        </w:rPr>
-        <w:t>Bail</w:t>
-      </w:r>
-      <w:r>
-        <w:rPr>
-          <w:rFonts w:ascii="Calibri" w:hAnsi="Calibri" w:cs="Calibri"/>
-          <w:sz w:val="22"/>
-          <w:szCs w:val="22"/>
-        </w:rPr>
-        <w:t xml:space="preserve"> dans</w:t>
-      </w:r>
-      <w:r>
-        <w:rPr>
-          <w:rFonts w:ascii="Calibri" w:hAnsi="Calibri" w:cs="Calibri"/>
-          <w:sz w:val="22"/>
-          <w:szCs w:val="22"/>
-        </w:rPr>
-        <w:t xml:space="preserve"> et sur</w:t>
-      </w:r>
-      <w:r>
-        <w:rPr>
-          <w:rFonts w:ascii="Calibri" w:hAnsi="Calibri" w:cs="Calibri"/>
-          <w:sz w:val="22"/>
-          <w:szCs w:val="22"/>
-        </w:rPr>
-        <w:t xml:space="preserve"> l’</w:t>
-      </w:r>
-      <w:r>
-        <w:rPr>
-          <w:rFonts w:ascii="Calibri" w:hAnsi="Calibri" w:cs="Calibri"/>
-          <w:sz w:val="22"/>
-          <w:szCs w:val="22"/>
-        </w:rPr>
-        <w:t>Immeuble</w:t>
-      </w:r>
-      <w:r>
-        <w:rPr>
-          <w:rFonts w:ascii="Calibri" w:hAnsi="Calibri" w:cs="Calibri"/>
-          <w:sz w:val="22"/>
-          <w:szCs w:val="22"/>
-        </w:rPr>
-        <w:t xml:space="preserve">, quelles qu’en soient la nature et la durée, cette dernière excédât-elle </w:t>
-      </w:r>
-      <w:r>
-        <w:rPr>
-          <w:rFonts w:ascii="Calibri" w:hAnsi="Calibri" w:cs="Calibri"/>
-          <w:sz w:val="22"/>
-          <w:szCs w:val="22"/>
-        </w:rPr>
-        <w:t>vingt et un</w:t>
-      </w:r>
-      <w:r>
-        <w:rPr>
-          <w:rFonts w:ascii="Calibri" w:hAnsi="Calibri" w:cs="Calibri"/>
-          <w:sz w:val="22"/>
-          <w:szCs w:val="22"/>
-        </w:rPr>
-        <w:t xml:space="preserve"> jours</w:t>
-      </w:r>
-      <w:r>
-        <w:rPr>
-          <w:rFonts w:ascii="Calibri" w:hAnsi="Calibri" w:cs="Calibri"/>
-          <w:sz w:val="22"/>
-          <w:szCs w:val="22"/>
-        </w:rPr>
-        <w:t xml:space="preserve"> et ce, par dérogation expresse à l’article 1724 du Code civil</w:t>
-      </w:r>
-      <w:r>
-        <w:rPr>
-          <w:rFonts w:ascii="Calibri" w:hAnsi="Calibri" w:cs="Calibri"/>
-          <w:sz w:val="22"/>
-          <w:szCs w:val="22"/>
-        </w:rPr>
-        <w:t>.</w:t>
-      </w:r>
-    </w:p>
-    <w:p>
-      <w:pPr>
-        <w:jc w:val="both"/>
-        <w:rPr>
-          <w:rFonts w:ascii="Calibri" w:hAnsi="Calibri" w:cs="Calibri"/>
-          <w:sz w:val="22"/>
-          <w:szCs w:val="22"/>
-        </w:rPr>
-      </w:pPr>
-    </w:p>
-    <w:p>
-      <w:pPr>
-        <w:jc w:val="both"/>
-        <w:rPr>
-          <w:rFonts w:ascii="Calibri" w:hAnsi="Calibri" w:cs="Calibri"/>
-          <w:sz w:val="22"/>
-          <w:szCs w:val="22"/>
-        </w:rPr>
-      </w:pPr>
-      <w:r>
-        <w:rPr>
-          <w:rFonts w:ascii="Calibri" w:hAnsi="Calibri" w:cs="Calibri"/>
-          <w:sz w:val="22"/>
-          <w:szCs w:val="22"/>
-        </w:rPr>
-        <w:t xml:space="preserve">En outre, le </w:t>
-      </w:r>
-      <w:r>
-        <w:rPr>
-          <w:rFonts w:ascii="Calibri" w:hAnsi="Calibri" w:cs="Calibri"/>
-          <w:sz w:val="22"/>
-          <w:szCs w:val="22"/>
-        </w:rPr>
-        <w:t>Bail</w:t>
-      </w:r>
-      <w:r>
-        <w:rPr>
-          <w:rFonts w:ascii="Calibri" w:hAnsi="Calibri" w:cs="Calibri"/>
-          <w:sz w:val="22"/>
-          <w:szCs w:val="22"/>
-        </w:rPr>
-        <w:t>leur</w:t>
-      </w:r>
-      <w:r>
-        <w:rPr>
-          <w:rFonts w:ascii="Calibri" w:hAnsi="Calibri" w:cs="Calibri"/>
-          <w:sz w:val="22"/>
-          <w:szCs w:val="22"/>
-        </w:rPr>
-        <w:t xml:space="preserve"> </w:t>
-      </w:r>
-      <w:r>
-        <w:rPr>
-          <w:rFonts w:ascii="Calibri" w:hAnsi="Calibri" w:cs="Calibri"/>
-          <w:sz w:val="22"/>
-          <w:szCs w:val="22"/>
-        </w:rPr>
-        <w:t xml:space="preserve">et/ou </w:t>
-      </w:r>
-      <w:r>
-        <w:rPr>
-          <w:rFonts w:ascii="Calibri" w:hAnsi="Calibri" w:cs="Calibri"/>
-          <w:sz w:val="22"/>
-          <w:szCs w:val="22"/>
-        </w:rPr>
-        <w:t>l’entité en charge de l’Immeuble</w:t>
-      </w:r>
-      <w:r>
-        <w:rPr>
-          <w:rFonts w:ascii="Calibri" w:hAnsi="Calibri" w:cs="Calibri"/>
-          <w:sz w:val="22"/>
-          <w:szCs w:val="22"/>
-        </w:rPr>
-        <w:t xml:space="preserve"> </w:t>
-      </w:r>
-      <w:r>
-        <w:rPr>
-          <w:rFonts w:ascii="Calibri" w:hAnsi="Calibri" w:cs="Calibri"/>
-          <w:sz w:val="22"/>
-          <w:szCs w:val="22"/>
-        </w:rPr>
-        <w:t>s</w:t>
-      </w:r>
-      <w:r>
-        <w:rPr>
-          <w:rFonts w:ascii="Calibri" w:hAnsi="Calibri" w:cs="Calibri"/>
-          <w:sz w:val="22"/>
-          <w:szCs w:val="22"/>
-        </w:rPr>
-        <w:t>e réserve la faculté d’apporter toute modification qu’il lui plaira à l’aspect intérieur ou extérieur de l’</w:t>
-      </w:r>
-      <w:r>
-        <w:rPr>
-          <w:rFonts w:ascii="Calibri" w:hAnsi="Calibri" w:cs="Calibri"/>
-          <w:sz w:val="22"/>
-          <w:szCs w:val="22"/>
-        </w:rPr>
-        <w:t>Immeuble</w:t>
-      </w:r>
-      <w:r>
-        <w:rPr>
-          <w:rFonts w:ascii="Calibri" w:hAnsi="Calibri" w:cs="Calibri"/>
-          <w:sz w:val="22"/>
-          <w:szCs w:val="22"/>
-        </w:rPr>
-        <w:t xml:space="preserve">, soit par des démolitions de bâtiments, soit par l’édification de constructions nouvelles, soit par tous travaux de modification des </w:t>
-      </w:r>
-      <w:r>
-        <w:rPr>
-          <w:rFonts w:ascii="Calibri" w:hAnsi="Calibri" w:cs="Calibri"/>
-          <w:sz w:val="22"/>
-          <w:szCs w:val="22"/>
-        </w:rPr>
-        <w:t>Parties Communes</w:t>
-      </w:r>
-      <w:r>
-        <w:rPr>
-          <w:rFonts w:ascii="Calibri" w:hAnsi="Calibri" w:cs="Calibri"/>
-          <w:sz w:val="22"/>
-          <w:szCs w:val="22"/>
-        </w:rPr>
-        <w:t xml:space="preserve"> ou à usage collectif, sans que le </w:t>
-      </w:r>
-      <w:r>
-        <w:rPr>
-          <w:rFonts w:ascii="Calibri" w:hAnsi="Calibri" w:cs="Calibri"/>
-          <w:sz w:val="22"/>
-          <w:szCs w:val="22"/>
-        </w:rPr>
-        <w:t>Preneur</w:t>
-      </w:r>
-      <w:r>
-        <w:rPr>
-          <w:rFonts w:ascii="Calibri" w:hAnsi="Calibri" w:cs="Calibri"/>
-          <w:sz w:val="22"/>
-          <w:szCs w:val="22"/>
-        </w:rPr>
-        <w:t xml:space="preserve"> ne puisse s’opposer à ces travaux.</w:t>
-      </w:r>
-    </w:p>
-    <w:p>
-      <w:pPr>
-        <w:jc w:val="both"/>
-        <w:rPr>
-          <w:rFonts w:ascii="Calibri" w:hAnsi="Calibri" w:cs="Calibri"/>
-          <w:sz w:val="22"/>
-          <w:szCs w:val="22"/>
-        </w:rPr>
-      </w:pPr>
-    </w:p>
-    <w:p>
-      <w:pPr>
-        <w:jc w:val="both"/>
-        <w:rPr>
-          <w:rFonts w:ascii="Calibri" w:hAnsi="Calibri" w:cs="Calibri"/>
-          <w:sz w:val="22"/>
-          <w:szCs w:val="22"/>
-        </w:rPr>
-      </w:pPr>
-      <w:r>
-        <w:rPr>
-          <w:rFonts w:ascii="Calibri" w:hAnsi="Calibri" w:cs="Calibri"/>
-          <w:sz w:val="22"/>
-          <w:szCs w:val="22"/>
-        </w:rPr>
-        <w:t xml:space="preserve">Le </w:t>
-      </w:r>
-      <w:r>
-        <w:rPr>
-          <w:rFonts w:ascii="Calibri" w:hAnsi="Calibri" w:cs="Calibri"/>
-          <w:sz w:val="22"/>
-          <w:szCs w:val="22"/>
-        </w:rPr>
-        <w:t>Preneur</w:t>
-      </w:r>
-      <w:r>
-        <w:rPr>
-          <w:rFonts w:ascii="Calibri" w:hAnsi="Calibri" w:cs="Calibri"/>
-          <w:sz w:val="22"/>
-          <w:szCs w:val="22"/>
-        </w:rPr>
-        <w:t xml:space="preserve"> s’engage à supporter de la même manière les travaux qui seraient exécutés sur la voie publique ou dans les </w:t>
-      </w:r>
-      <w:r>
-        <w:rPr>
-          <w:rFonts w:ascii="Calibri" w:hAnsi="Calibri" w:cs="Calibri"/>
-          <w:sz w:val="22"/>
-          <w:szCs w:val="22"/>
-        </w:rPr>
-        <w:t>i</w:t>
-      </w:r>
-      <w:r>
-        <w:rPr>
-          <w:rFonts w:ascii="Calibri" w:hAnsi="Calibri" w:cs="Calibri"/>
-          <w:sz w:val="22"/>
-          <w:szCs w:val="22"/>
-        </w:rPr>
-        <w:t>mmeuble</w:t>
-      </w:r>
-      <w:r>
-        <w:rPr>
-          <w:rFonts w:ascii="Calibri" w:hAnsi="Calibri" w:cs="Calibri"/>
-          <w:sz w:val="22"/>
-          <w:szCs w:val="22"/>
-        </w:rPr>
-        <w:t xml:space="preserve">s voisins, alors même qu’il en résulterait une gêne pour la jouissance des </w:t>
-      </w:r>
-      <w:r>
-        <w:rPr>
-          <w:rFonts w:ascii="Calibri" w:hAnsi="Calibri" w:cs="Calibri"/>
-          <w:sz w:val="22"/>
-          <w:szCs w:val="22"/>
-        </w:rPr>
-        <w:t>L</w:t>
-      </w:r>
-      <w:r>
-        <w:rPr>
-          <w:rFonts w:ascii="Calibri" w:hAnsi="Calibri" w:cs="Calibri"/>
-          <w:sz w:val="22"/>
-          <w:szCs w:val="22"/>
-        </w:rPr>
-        <w:t>ocaux</w:t>
-      </w:r>
-      <w:r>
-        <w:rPr>
-          <w:rFonts w:ascii="Calibri" w:hAnsi="Calibri" w:cs="Calibri"/>
-          <w:sz w:val="22"/>
-          <w:szCs w:val="22"/>
-        </w:rPr>
-        <w:t xml:space="preserve"> Loués</w:t>
-      </w:r>
-      <w:r>
-        <w:rPr>
-          <w:rFonts w:ascii="Calibri" w:hAnsi="Calibri" w:cs="Calibri"/>
-          <w:sz w:val="22"/>
-          <w:szCs w:val="22"/>
-        </w:rPr>
-        <w:t xml:space="preserve"> et quand bien même la durée de ces travaux excèderait </w:t>
-      </w:r>
-      <w:r>
-        <w:rPr>
-          <w:rFonts w:ascii="Calibri" w:hAnsi="Calibri" w:cs="Calibri"/>
-          <w:sz w:val="22"/>
-          <w:szCs w:val="22"/>
-        </w:rPr>
-        <w:t>vingt et un</w:t>
-      </w:r>
-      <w:r>
-        <w:rPr>
-          <w:rFonts w:ascii="Calibri" w:hAnsi="Calibri" w:cs="Calibri"/>
-          <w:sz w:val="22"/>
-          <w:szCs w:val="22"/>
-        </w:rPr>
-        <w:t xml:space="preserve"> jours, sauf à exercer personnellement un recours </w:t>
-      </w:r>
-      <w:r>
-        <w:rPr>
-          <w:rFonts w:ascii="Calibri" w:hAnsi="Calibri" w:cs="Calibri"/>
-          <w:sz w:val="22"/>
-          <w:szCs w:val="22"/>
-        </w:rPr>
-        <w:t>contre l’Administration, l’entre</w:t>
-      </w:r>
-      <w:r>
-        <w:rPr>
-          <w:rFonts w:ascii="Calibri" w:hAnsi="Calibri" w:cs="Calibri"/>
-          <w:sz w:val="22"/>
-          <w:szCs w:val="22"/>
-        </w:rPr>
-        <w:t>p</w:t>
-      </w:r>
-      <w:r>
-        <w:rPr>
-          <w:rFonts w:ascii="Calibri" w:hAnsi="Calibri" w:cs="Calibri"/>
-          <w:sz w:val="22"/>
-          <w:szCs w:val="22"/>
-        </w:rPr>
-        <w:t>reneur</w:t>
-      </w:r>
-      <w:r>
-        <w:rPr>
-          <w:rFonts w:ascii="Calibri" w:hAnsi="Calibri" w:cs="Calibri"/>
-          <w:sz w:val="22"/>
-          <w:szCs w:val="22"/>
-        </w:rPr>
-        <w:t xml:space="preserve"> de travaux ou les propriétaires voisins, sans que le </w:t>
-      </w:r>
-      <w:r>
-        <w:rPr>
-          <w:rFonts w:ascii="Calibri" w:hAnsi="Calibri" w:cs="Calibri"/>
-          <w:sz w:val="22"/>
-          <w:szCs w:val="22"/>
-        </w:rPr>
-        <w:t>Bail</w:t>
-      </w:r>
-      <w:r>
-        <w:rPr>
-          <w:rFonts w:ascii="Calibri" w:hAnsi="Calibri" w:cs="Calibri"/>
-          <w:sz w:val="22"/>
-          <w:szCs w:val="22"/>
-        </w:rPr>
-        <w:t>leur</w:t>
-      </w:r>
-      <w:r>
-        <w:rPr>
-          <w:rFonts w:ascii="Calibri" w:hAnsi="Calibri" w:cs="Calibri"/>
-          <w:sz w:val="22"/>
-          <w:szCs w:val="22"/>
-        </w:rPr>
-        <w:t xml:space="preserve"> ne soit jamais ni recherché ni inquiété à ce sujet.</w:t>
-      </w:r>
-    </w:p>
-    <w:p>
-      <w:pPr>
-        <w:jc w:val="both"/>
-        <w:rPr>
-          <w:rFonts w:ascii="Calibri" w:hAnsi="Calibri" w:cs="Calibri"/>
-          <w:sz w:val="22"/>
-          <w:szCs w:val="22"/>
-        </w:rPr>
-      </w:pPr>
-    </w:p>
-    <w:p>
-      <w:pPr>
-        <w:jc w:val="both"/>
-        <w:rPr>
-          <w:rFonts w:ascii="Calibri" w:hAnsi="Calibri" w:cs="Calibri"/>
-          <w:sz w:val="22"/>
-          <w:szCs w:val="22"/>
-        </w:rPr>
-      </w:pPr>
-      <w:r>
-        <w:rPr>
-          <w:rFonts w:ascii="Calibri" w:hAnsi="Calibri" w:cs="Calibri"/>
-          <w:sz w:val="22"/>
-          <w:szCs w:val="22"/>
-        </w:rPr>
-        <w:t xml:space="preserve">Le </w:t>
-      </w:r>
-      <w:r>
-        <w:rPr>
-          <w:rFonts w:ascii="Calibri" w:hAnsi="Calibri" w:cs="Calibri"/>
-          <w:sz w:val="22"/>
-          <w:szCs w:val="22"/>
-        </w:rPr>
-        <w:t>Bail</w:t>
-      </w:r>
-      <w:r>
-        <w:rPr>
-          <w:rFonts w:ascii="Calibri" w:hAnsi="Calibri" w:cs="Calibri"/>
-          <w:sz w:val="22"/>
-          <w:szCs w:val="22"/>
-        </w:rPr>
-        <w:t>leur</w:t>
-      </w:r>
-      <w:r>
-        <w:rPr>
-          <w:rFonts w:ascii="Calibri" w:hAnsi="Calibri" w:cs="Calibri"/>
-          <w:sz w:val="22"/>
-          <w:szCs w:val="22"/>
-        </w:rPr>
-        <w:t xml:space="preserve"> et/ou </w:t>
-      </w:r>
-      <w:r>
-        <w:rPr>
-          <w:rFonts w:ascii="Calibri" w:hAnsi="Calibri" w:cs="Calibri"/>
-          <w:sz w:val="22"/>
-          <w:szCs w:val="22"/>
-        </w:rPr>
-        <w:t>l’entité en charge de l’Immeuble</w:t>
-      </w:r>
-      <w:r>
-        <w:rPr>
-          <w:rFonts w:ascii="Calibri" w:hAnsi="Calibri" w:cs="Calibri"/>
-          <w:sz w:val="22"/>
-          <w:szCs w:val="22"/>
-        </w:rPr>
-        <w:t xml:space="preserve"> </w:t>
-      </w:r>
-      <w:r>
-        <w:rPr>
-          <w:rFonts w:ascii="Calibri" w:hAnsi="Calibri" w:cs="Calibri"/>
-          <w:sz w:val="22"/>
-          <w:szCs w:val="22"/>
-        </w:rPr>
-        <w:t>aura le droit d’installer, entretenir, utiliser, réparer, remplacer les tubes, conduites, câbles, fils et équipements de toute nature pouvant même desservir d’autres parties de l’</w:t>
-      </w:r>
-      <w:r>
-        <w:rPr>
-          <w:rFonts w:ascii="Calibri" w:hAnsi="Calibri" w:cs="Calibri"/>
-          <w:sz w:val="22"/>
-          <w:szCs w:val="22"/>
-        </w:rPr>
-        <w:t>Immeuble</w:t>
-      </w:r>
-      <w:r>
-        <w:rPr>
-          <w:rFonts w:ascii="Calibri" w:hAnsi="Calibri" w:cs="Calibri"/>
-          <w:sz w:val="22"/>
-          <w:szCs w:val="22"/>
-        </w:rPr>
-        <w:t xml:space="preserve"> et qui traversent les </w:t>
-      </w:r>
-      <w:r>
-        <w:rPr>
-          <w:rFonts w:ascii="Calibri" w:hAnsi="Calibri" w:cs="Calibri"/>
-          <w:sz w:val="22"/>
-          <w:szCs w:val="22"/>
-        </w:rPr>
-        <w:t>Locaux Loués</w:t>
-      </w:r>
-      <w:r>
-        <w:rPr>
-          <w:rFonts w:ascii="Calibri" w:hAnsi="Calibri" w:cs="Calibri"/>
-          <w:sz w:val="22"/>
-          <w:szCs w:val="22"/>
-        </w:rPr>
-        <w:t xml:space="preserve">, le Preneur ne pouvant en </w:t>
-      </w:r>
-      <w:r>
-        <w:rPr>
-          <w:rFonts w:ascii="Calibri" w:hAnsi="Calibri" w:cs="Calibri"/>
-          <w:sz w:val="22"/>
-          <w:szCs w:val="22"/>
-        </w:rPr>
-        <w:t>interdire</w:t>
-      </w:r>
-      <w:r>
-        <w:rPr>
-          <w:rFonts w:ascii="Calibri" w:hAnsi="Calibri" w:cs="Calibri"/>
-          <w:sz w:val="22"/>
-          <w:szCs w:val="22"/>
-        </w:rPr>
-        <w:t xml:space="preserve"> l’accès</w:t>
-      </w:r>
-      <w:r>
-        <w:rPr>
-          <w:rFonts w:ascii="Calibri" w:hAnsi="Calibri" w:cs="Calibri"/>
-          <w:sz w:val="22"/>
-          <w:szCs w:val="22"/>
-        </w:rPr>
-        <w:t>.</w:t>
-      </w:r>
-    </w:p>
-    <w:p>
-      <w:pPr>
-        <w:jc w:val="both"/>
-        <w:rPr>
-          <w:rFonts w:ascii="Calibri" w:hAnsi="Calibri" w:cs="Calibri"/>
-          <w:sz w:val="22"/>
-          <w:szCs w:val="22"/>
-        </w:rPr>
-      </w:pPr>
-    </w:p>
-    <w:p>
-      <w:pPr>
-        <w:jc w:val="both"/>
-        <w:rPr>
-          <w:rFonts w:ascii="Calibri" w:hAnsi="Calibri" w:cs="Calibri"/>
-          <w:sz w:val="22"/>
-          <w:szCs w:val="22"/>
-        </w:rPr>
-      </w:pPr>
-      <w:r>
-        <w:rPr>
-          <w:rFonts w:ascii="Calibri" w:hAnsi="Calibri" w:cs="Calibri"/>
-          <w:sz w:val="22"/>
-          <w:szCs w:val="22"/>
-        </w:rPr>
-        <w:t xml:space="preserve">En conséquence, le </w:t>
-      </w:r>
-      <w:r>
-        <w:rPr>
-          <w:rFonts w:ascii="Calibri" w:hAnsi="Calibri" w:cs="Calibri"/>
-          <w:sz w:val="22"/>
-          <w:szCs w:val="22"/>
-        </w:rPr>
-        <w:t>Preneur</w:t>
-      </w:r>
-      <w:r>
-        <w:rPr>
-          <w:rFonts w:ascii="Calibri" w:hAnsi="Calibri" w:cs="Calibri"/>
-          <w:sz w:val="22"/>
-          <w:szCs w:val="22"/>
-        </w:rPr>
-        <w:t xml:space="preserve"> devra laisser traverser ses locaux par toutes canalisations existantes ou </w:t>
-      </w:r>
-      <w:r>
-        <w:rPr>
-          <w:rFonts w:ascii="Calibri" w:hAnsi="Calibri" w:cs="Calibri"/>
-          <w:sz w:val="22"/>
-          <w:szCs w:val="22"/>
-        </w:rPr>
-        <w:t>futurs nécessaires</w:t>
-      </w:r>
-      <w:r>
-        <w:rPr>
-          <w:rFonts w:ascii="Calibri" w:hAnsi="Calibri" w:cs="Calibri"/>
-          <w:sz w:val="22"/>
-          <w:szCs w:val="22"/>
-        </w:rPr>
-        <w:t xml:space="preserve"> à la desserte de ses locaux, d’autres locaux de l’</w:t>
-      </w:r>
-      <w:r>
-        <w:rPr>
-          <w:rFonts w:ascii="Calibri" w:hAnsi="Calibri" w:cs="Calibri"/>
-          <w:sz w:val="22"/>
-          <w:szCs w:val="22"/>
-        </w:rPr>
-        <w:t>Immeuble</w:t>
-      </w:r>
-      <w:r>
-        <w:rPr>
-          <w:rFonts w:ascii="Calibri" w:hAnsi="Calibri" w:cs="Calibri"/>
-          <w:sz w:val="22"/>
-          <w:szCs w:val="22"/>
-        </w:rPr>
-        <w:t xml:space="preserve"> ou des parties ou éléments d’équipements collectifs ou communs de l’</w:t>
-      </w:r>
-      <w:r>
-        <w:rPr>
-          <w:rFonts w:ascii="Calibri" w:hAnsi="Calibri" w:cs="Calibri"/>
-          <w:sz w:val="22"/>
-          <w:szCs w:val="22"/>
-        </w:rPr>
-        <w:t>Immeuble</w:t>
-      </w:r>
-      <w:r>
-        <w:rPr>
-          <w:rFonts w:ascii="Calibri" w:hAnsi="Calibri" w:cs="Calibri"/>
-          <w:sz w:val="22"/>
-          <w:szCs w:val="22"/>
-        </w:rPr>
-        <w:t>.</w:t>
-      </w:r>
-    </w:p>
-    <w:p>
-      <w:pPr>
-        <w:jc w:val="both"/>
-        <w:rPr>
-          <w:rFonts w:ascii="Calibri" w:hAnsi="Calibri" w:cs="Calibri"/>
-          <w:sz w:val="22"/>
-          <w:szCs w:val="22"/>
-        </w:rPr>
-      </w:pPr>
-    </w:p>
-    <w:p>
-      <w:pPr>
-        <w:jc w:val="both"/>
-        <w:rPr>
-          <w:rFonts w:ascii="Calibri" w:hAnsi="Calibri" w:cs="Calibri"/>
-          <w:sz w:val="22"/>
-          <w:szCs w:val="22"/>
-        </w:rPr>
-      </w:pPr>
-      <w:r>
-        <w:rPr>
-          <w:rFonts w:ascii="Calibri" w:hAnsi="Calibri" w:cs="Calibri"/>
-          <w:sz w:val="22"/>
-          <w:szCs w:val="22"/>
-        </w:rPr>
-        <w:t>Pour répondre aux besoins de ses statistiques, l</w:t>
-      </w:r>
-      <w:r>
-        <w:rPr>
-          <w:rFonts w:ascii="Calibri" w:hAnsi="Calibri" w:cs="Calibri"/>
-          <w:sz w:val="22"/>
-          <w:szCs w:val="22"/>
-        </w:rPr>
-        <w:t xml:space="preserve">e </w:t>
-      </w:r>
-      <w:r>
-        <w:rPr>
-          <w:rFonts w:ascii="Calibri" w:hAnsi="Calibri" w:cs="Calibri"/>
-          <w:sz w:val="22"/>
-          <w:szCs w:val="22"/>
-        </w:rPr>
-        <w:t>Bail</w:t>
-      </w:r>
-      <w:r>
-        <w:rPr>
-          <w:rFonts w:ascii="Calibri" w:hAnsi="Calibri" w:cs="Calibri"/>
-          <w:sz w:val="22"/>
-          <w:szCs w:val="22"/>
-        </w:rPr>
-        <w:t xml:space="preserve">leur se réserve la faculté d’installer à ses frais </w:t>
-      </w:r>
-      <w:r>
-        <w:rPr>
-          <w:rFonts w:ascii="Calibri" w:hAnsi="Calibri" w:cs="Calibri"/>
-          <w:sz w:val="22"/>
-          <w:szCs w:val="22"/>
-        </w:rPr>
-        <w:t xml:space="preserve">à l’entrée des </w:t>
-      </w:r>
-      <w:r>
-        <w:rPr>
-          <w:rFonts w:ascii="Calibri" w:hAnsi="Calibri" w:cs="Calibri"/>
-          <w:sz w:val="22"/>
-          <w:szCs w:val="22"/>
-        </w:rPr>
-        <w:t>Locaux Loués</w:t>
-      </w:r>
-      <w:r>
-        <w:rPr>
-          <w:rFonts w:ascii="Calibri" w:hAnsi="Calibri" w:cs="Calibri"/>
-          <w:sz w:val="22"/>
-          <w:szCs w:val="22"/>
-        </w:rPr>
-        <w:t xml:space="preserve"> </w:t>
-      </w:r>
-      <w:r>
-        <w:rPr>
-          <w:rFonts w:ascii="Calibri" w:hAnsi="Calibri" w:cs="Calibri"/>
-          <w:sz w:val="22"/>
-          <w:szCs w:val="22"/>
-        </w:rPr>
-        <w:t xml:space="preserve">un compteur de flux </w:t>
-      </w:r>
-      <w:r>
-        <w:rPr>
-          <w:rFonts w:ascii="Calibri" w:hAnsi="Calibri" w:cs="Calibri"/>
-          <w:sz w:val="22"/>
-          <w:szCs w:val="22"/>
-        </w:rPr>
-        <w:t>de clientèle dont il gardera la propriété des données collectées</w:t>
-      </w:r>
-      <w:r>
-        <w:rPr>
-          <w:rFonts w:ascii="Calibri" w:hAnsi="Calibri" w:cs="Calibri"/>
-          <w:sz w:val="22"/>
-          <w:szCs w:val="22"/>
-        </w:rPr>
-        <w:t>. Le Bailleur pourra communiquer les données collectées au Preneur si celui-ci lui en fait la demande.</w:t>
-      </w:r>
-      <w:r>
-        <w:rPr>
-          <w:rFonts w:ascii="Calibri" w:hAnsi="Calibri" w:cs="Calibri"/>
-          <w:sz w:val="22"/>
-          <w:szCs w:val="22"/>
-        </w:rPr>
-        <w:t xml:space="preserve"> </w:t>
-      </w:r>
-      <w:r>
-        <w:rPr>
-          <w:rFonts w:ascii="Calibri" w:hAnsi="Calibri" w:cs="Calibri"/>
-          <w:sz w:val="22"/>
-          <w:szCs w:val="22"/>
-        </w:rPr>
-        <w:t xml:space="preserve">Le Preneur qui en sera informé par tous moyens, et notamment par courriel, moyennant un préavis d’un mois ne pourra en </w:t>
-      </w:r>
-      <w:r>
-        <w:rPr>
-          <w:rFonts w:ascii="Calibri" w:hAnsi="Calibri" w:cs="Calibri"/>
-          <w:sz w:val="22"/>
-          <w:szCs w:val="22"/>
-        </w:rPr>
-        <w:t>interdire</w:t>
-      </w:r>
-      <w:r>
-        <w:rPr>
-          <w:rFonts w:ascii="Calibri" w:hAnsi="Calibri" w:cs="Calibri"/>
-          <w:sz w:val="22"/>
-          <w:szCs w:val="22"/>
-        </w:rPr>
-        <w:t xml:space="preserve"> la pose.</w:t>
-      </w:r>
-      <w:bookmarkEnd w:id="15"/>
     </w:p>
     <w:p>
       <w:pPr>
@@ -10457,199 +10492,199 @@
           <w:sz w:val="22"/>
           <w:szCs w:val="22"/>
         </w:rPr>
+        <w:t>Par ailleurs</w:t>
+      </w:r>
+      <w:r>
+        <w:rPr>
+          <w:rFonts w:ascii="Calibri" w:hAnsi="Calibri" w:cs="Calibri"/>
+          <w:sz w:val="22"/>
+          <w:szCs w:val="22"/>
+        </w:rPr>
+        <w:t xml:space="preserve">, dans le cas du départ du Preneur, </w:t>
+      </w:r>
+      <w:r>
+        <w:rPr>
+          <w:rFonts w:ascii="Calibri" w:hAnsi="Calibri" w:cs="Calibri"/>
+          <w:sz w:val="22"/>
+          <w:szCs w:val="22"/>
+        </w:rPr>
+        <w:t>quel qu’en</w:t>
+      </w:r>
+      <w:r>
+        <w:rPr>
+          <w:rFonts w:ascii="Calibri" w:hAnsi="Calibri" w:cs="Calibri"/>
+          <w:sz w:val="22"/>
+          <w:szCs w:val="22"/>
+        </w:rPr>
+        <w:t xml:space="preserve"> soient les </w:t>
+      </w:r>
+      <w:r>
+        <w:rPr>
+          <w:rFonts w:ascii="Calibri" w:hAnsi="Calibri" w:cs="Calibri"/>
+          <w:sz w:val="22"/>
+          <w:szCs w:val="22"/>
+        </w:rPr>
+        <w:t>raisons,</w:t>
+      </w:r>
+      <w:r>
+        <w:rPr>
+          <w:rFonts w:ascii="Calibri" w:hAnsi="Calibri" w:cs="Calibri"/>
+          <w:sz w:val="22"/>
+          <w:szCs w:val="22"/>
+        </w:rPr>
+        <w:t xml:space="preserve"> l</w:t>
+      </w:r>
+      <w:r>
+        <w:rPr>
+          <w:rFonts w:ascii="Calibri" w:hAnsi="Calibri" w:cs="Calibri"/>
+          <w:sz w:val="22"/>
+          <w:szCs w:val="22"/>
+        </w:rPr>
+        <w:t xml:space="preserve">e </w:t>
+      </w:r>
+      <w:r>
+        <w:rPr>
+          <w:rFonts w:ascii="Calibri" w:hAnsi="Calibri" w:cs="Calibri"/>
+          <w:sz w:val="22"/>
+          <w:szCs w:val="22"/>
+        </w:rPr>
+        <w:t>Preneur</w:t>
+      </w:r>
+      <w:r>
+        <w:rPr>
+          <w:rFonts w:ascii="Calibri" w:hAnsi="Calibri" w:cs="Calibri"/>
+          <w:sz w:val="22"/>
+          <w:szCs w:val="22"/>
+        </w:rPr>
+        <w:t xml:space="preserve"> devra laisser visiter les lieux par le </w:t>
+      </w:r>
+      <w:r>
+        <w:rPr>
+          <w:rFonts w:ascii="Calibri" w:hAnsi="Calibri" w:cs="Calibri"/>
+          <w:sz w:val="22"/>
+          <w:szCs w:val="22"/>
+        </w:rPr>
+        <w:t>Bail</w:t>
+      </w:r>
+      <w:r>
+        <w:rPr>
+          <w:rFonts w:ascii="Calibri" w:hAnsi="Calibri" w:cs="Calibri"/>
+          <w:sz w:val="22"/>
+          <w:szCs w:val="22"/>
+        </w:rPr>
+        <w:t>leur</w:t>
+      </w:r>
+      <w:r>
+        <w:rPr>
+          <w:rFonts w:ascii="Calibri" w:hAnsi="Calibri" w:cs="Calibri"/>
+          <w:sz w:val="22"/>
+          <w:szCs w:val="22"/>
+        </w:rPr>
+        <w:t xml:space="preserve"> ou ses représentants </w:t>
+      </w:r>
+      <w:r>
+        <w:rPr>
+          <w:rFonts w:ascii="Calibri" w:hAnsi="Calibri" w:cs="Calibri"/>
+          <w:sz w:val="22"/>
+          <w:szCs w:val="22"/>
+        </w:rPr>
+        <w:t xml:space="preserve">ou toute personne dûment autorisée </w:t>
+      </w:r>
+      <w:r>
+        <w:rPr>
+          <w:rFonts w:ascii="Calibri" w:hAnsi="Calibri" w:cs="Calibri"/>
+          <w:sz w:val="22"/>
+          <w:szCs w:val="22"/>
+        </w:rPr>
+        <w:t xml:space="preserve">pendant une période de six mois précédant la date effective du départ du locataire et souffrir l’apposition d’écriteaux ou d’affiches à tel emplacement convenant au </w:t>
+      </w:r>
+      <w:r>
+        <w:rPr>
+          <w:rFonts w:ascii="Calibri" w:hAnsi="Calibri" w:cs="Calibri"/>
+          <w:sz w:val="22"/>
+          <w:szCs w:val="22"/>
+        </w:rPr>
+        <w:t>Bail</w:t>
+      </w:r>
+      <w:r>
+        <w:rPr>
+          <w:rFonts w:ascii="Calibri" w:hAnsi="Calibri" w:cs="Calibri"/>
+          <w:sz w:val="22"/>
+          <w:szCs w:val="22"/>
+        </w:rPr>
+        <w:t>leur</w:t>
+      </w:r>
+      <w:r>
+        <w:rPr>
+          <w:rFonts w:ascii="Calibri" w:hAnsi="Calibri" w:cs="Calibri"/>
+          <w:sz w:val="22"/>
+          <w:szCs w:val="22"/>
+        </w:rPr>
+        <w:t>.</w:t>
+      </w:r>
+      <w:r>
+        <w:rPr>
+          <w:rFonts w:ascii="Calibri" w:hAnsi="Calibri" w:cs="Calibri"/>
+          <w:sz w:val="22"/>
+          <w:szCs w:val="22"/>
+        </w:rPr>
+        <w:t xml:space="preserve"> </w:t>
+      </w:r>
+    </w:p>
+    <w:p>
+      <w:pPr>
+        <w:jc w:val="both"/>
+        <w:rPr>
+          <w:rFonts w:ascii="Calibri" w:hAnsi="Calibri" w:cs="Calibri"/>
+          <w:sz w:val="22"/>
+          <w:szCs w:val="22"/>
+        </w:rPr>
+      </w:pPr>
+    </w:p>
+    <w:p>
+      <w:pPr>
+        <w:jc w:val="both"/>
+        <w:rPr>
+          <w:rFonts w:ascii="Calibri" w:hAnsi="Calibri" w:cs="Calibri"/>
+          <w:sz w:val="22"/>
+          <w:szCs w:val="22"/>
+        </w:rPr>
+      </w:pPr>
+      <w:r>
+        <w:rPr>
+          <w:rFonts w:ascii="Calibri" w:hAnsi="Calibri" w:cs="Calibri"/>
+          <w:sz w:val="22"/>
+          <w:szCs w:val="22"/>
+        </w:rPr>
+        <w:t>Il est également convenu entre les Parties que dans ces conditions, le Bailleur aura également l’autorisation de réaliser une visite virtuelle des Locaux Loués à ses frais, par le prestataire de son choix, aux fins de commercialisation des Locaux Loués.</w:t>
+      </w:r>
+    </w:p>
+    <w:p>
+      <w:pPr>
+        <w:jc w:val="both"/>
+        <w:rPr>
+          <w:rFonts w:ascii="Calibri" w:hAnsi="Calibri" w:cs="Calibri"/>
+          <w:sz w:val="22"/>
+          <w:szCs w:val="22"/>
+        </w:rPr>
+      </w:pPr>
+    </w:p>
+    <w:p>
+      <w:pPr>
+        <w:jc w:val="both"/>
+        <w:rPr>
+          <w:rFonts w:ascii="Calibri" w:hAnsi="Calibri" w:cs="Calibri"/>
+          <w:sz w:val="22"/>
+          <w:szCs w:val="22"/>
+        </w:rPr>
+      </w:pPr>
+      <w:r>
+        <w:rPr>
+          <w:rFonts w:ascii="Calibri" w:hAnsi="Calibri" w:cs="Calibri"/>
+          <w:sz w:val="22"/>
+          <w:szCs w:val="22"/>
+        </w:rPr>
         <w:lastRenderedPageBreak/>
-        <w:t>Par ailleurs</w:t>
-      </w:r>
-      <w:r>
-        <w:rPr>
-          <w:rFonts w:ascii="Calibri" w:hAnsi="Calibri" w:cs="Calibri"/>
-          <w:sz w:val="22"/>
-          <w:szCs w:val="22"/>
-        </w:rPr>
-        <w:t xml:space="preserve">, dans le cas du départ du Preneur, </w:t>
-      </w:r>
-      <w:r>
-        <w:rPr>
-          <w:rFonts w:ascii="Calibri" w:hAnsi="Calibri" w:cs="Calibri"/>
-          <w:sz w:val="22"/>
-          <w:szCs w:val="22"/>
-        </w:rPr>
-        <w:t>quel qu’en</w:t>
-      </w:r>
-      <w:r>
-        <w:rPr>
-          <w:rFonts w:ascii="Calibri" w:hAnsi="Calibri" w:cs="Calibri"/>
-          <w:sz w:val="22"/>
-          <w:szCs w:val="22"/>
-        </w:rPr>
-        <w:t xml:space="preserve"> soient les </w:t>
-      </w:r>
-      <w:r>
-        <w:rPr>
-          <w:rFonts w:ascii="Calibri" w:hAnsi="Calibri" w:cs="Calibri"/>
-          <w:sz w:val="22"/>
-          <w:szCs w:val="22"/>
-        </w:rPr>
-        <w:t>raisons,</w:t>
-      </w:r>
-      <w:r>
-        <w:rPr>
-          <w:rFonts w:ascii="Calibri" w:hAnsi="Calibri" w:cs="Calibri"/>
-          <w:sz w:val="22"/>
-          <w:szCs w:val="22"/>
-        </w:rPr>
-        <w:t xml:space="preserve"> l</w:t>
-      </w:r>
-      <w:r>
-        <w:rPr>
-          <w:rFonts w:ascii="Calibri" w:hAnsi="Calibri" w:cs="Calibri"/>
-          <w:sz w:val="22"/>
-          <w:szCs w:val="22"/>
-        </w:rPr>
-        <w:t xml:space="preserve">e </w:t>
-      </w:r>
-      <w:r>
-        <w:rPr>
-          <w:rFonts w:ascii="Calibri" w:hAnsi="Calibri" w:cs="Calibri"/>
-          <w:sz w:val="22"/>
-          <w:szCs w:val="22"/>
-        </w:rPr>
-        <w:t>Preneur</w:t>
-      </w:r>
-      <w:r>
-        <w:rPr>
-          <w:rFonts w:ascii="Calibri" w:hAnsi="Calibri" w:cs="Calibri"/>
-          <w:sz w:val="22"/>
-          <w:szCs w:val="22"/>
-        </w:rPr>
-        <w:t xml:space="preserve"> devra laisser visiter les lieux par le </w:t>
-      </w:r>
-      <w:r>
-        <w:rPr>
-          <w:rFonts w:ascii="Calibri" w:hAnsi="Calibri" w:cs="Calibri"/>
-          <w:sz w:val="22"/>
-          <w:szCs w:val="22"/>
-        </w:rPr>
-        <w:t>Bail</w:t>
-      </w:r>
-      <w:r>
-        <w:rPr>
-          <w:rFonts w:ascii="Calibri" w:hAnsi="Calibri" w:cs="Calibri"/>
-          <w:sz w:val="22"/>
-          <w:szCs w:val="22"/>
-        </w:rPr>
-        <w:t>leur</w:t>
-      </w:r>
-      <w:r>
-        <w:rPr>
-          <w:rFonts w:ascii="Calibri" w:hAnsi="Calibri" w:cs="Calibri"/>
-          <w:sz w:val="22"/>
-          <w:szCs w:val="22"/>
-        </w:rPr>
-        <w:t xml:space="preserve"> ou ses représentants </w:t>
-      </w:r>
-      <w:r>
-        <w:rPr>
-          <w:rFonts w:ascii="Calibri" w:hAnsi="Calibri" w:cs="Calibri"/>
-          <w:sz w:val="22"/>
-          <w:szCs w:val="22"/>
-        </w:rPr>
-        <w:t xml:space="preserve">ou toute personne dûment autorisée </w:t>
-      </w:r>
-      <w:r>
-        <w:rPr>
-          <w:rFonts w:ascii="Calibri" w:hAnsi="Calibri" w:cs="Calibri"/>
-          <w:sz w:val="22"/>
-          <w:szCs w:val="22"/>
-        </w:rPr>
-        <w:t xml:space="preserve">pendant une période de six mois précédant la date effective du départ du locataire et souffrir l’apposition d’écriteaux ou d’affiches à tel emplacement convenant au </w:t>
-      </w:r>
-      <w:r>
-        <w:rPr>
-          <w:rFonts w:ascii="Calibri" w:hAnsi="Calibri" w:cs="Calibri"/>
-          <w:sz w:val="22"/>
-          <w:szCs w:val="22"/>
-        </w:rPr>
-        <w:t>Bail</w:t>
-      </w:r>
-      <w:r>
-        <w:rPr>
-          <w:rFonts w:ascii="Calibri" w:hAnsi="Calibri" w:cs="Calibri"/>
-          <w:sz w:val="22"/>
-          <w:szCs w:val="22"/>
-        </w:rPr>
-        <w:t>leur</w:t>
-      </w:r>
-      <w:r>
-        <w:rPr>
-          <w:rFonts w:ascii="Calibri" w:hAnsi="Calibri" w:cs="Calibri"/>
-          <w:sz w:val="22"/>
-          <w:szCs w:val="22"/>
-        </w:rPr>
-        <w:t>.</w:t>
-      </w:r>
-      <w:r>
-        <w:rPr>
-          <w:rFonts w:ascii="Calibri" w:hAnsi="Calibri" w:cs="Calibri"/>
-          <w:sz w:val="22"/>
-          <w:szCs w:val="22"/>
-        </w:rPr>
-        <w:t xml:space="preserve"> </w:t>
-      </w:r>
-    </w:p>
-    <w:p>
-      <w:pPr>
-        <w:jc w:val="both"/>
-        <w:rPr>
-          <w:rFonts w:ascii="Calibri" w:hAnsi="Calibri" w:cs="Calibri"/>
-          <w:sz w:val="22"/>
-          <w:szCs w:val="22"/>
-        </w:rPr>
-      </w:pPr>
-    </w:p>
-    <w:p>
-      <w:pPr>
-        <w:jc w:val="both"/>
-        <w:rPr>
-          <w:rFonts w:ascii="Calibri" w:hAnsi="Calibri" w:cs="Calibri"/>
-          <w:sz w:val="22"/>
-          <w:szCs w:val="22"/>
-        </w:rPr>
-      </w:pPr>
-      <w:r>
-        <w:rPr>
-          <w:rFonts w:ascii="Calibri" w:hAnsi="Calibri" w:cs="Calibri"/>
-          <w:sz w:val="22"/>
-          <w:szCs w:val="22"/>
-        </w:rPr>
-        <w:t>Il est également convenu entre les Parties que dans ces conditions, le Bailleur aura également l’autorisation de réaliser une visite virtuelle des Locaux Loués à ses frais, par le prestataire de son choix, aux fins de commercialisation des Locaux Loués.</w:t>
-      </w:r>
-    </w:p>
-    <w:p>
-      <w:pPr>
-        <w:jc w:val="both"/>
-        <w:rPr>
-          <w:rFonts w:ascii="Calibri" w:hAnsi="Calibri" w:cs="Calibri"/>
-          <w:sz w:val="22"/>
-          <w:szCs w:val="22"/>
-        </w:rPr>
-      </w:pPr>
-    </w:p>
-    <w:p>
-      <w:pPr>
-        <w:jc w:val="both"/>
-        <w:rPr>
-          <w:rFonts w:ascii="Calibri" w:hAnsi="Calibri" w:cs="Calibri"/>
-          <w:sz w:val="22"/>
-          <w:szCs w:val="22"/>
-        </w:rPr>
-      </w:pPr>
-      <w:r>
-        <w:rPr>
-          <w:rFonts w:ascii="Calibri" w:hAnsi="Calibri" w:cs="Calibri"/>
-          <w:sz w:val="22"/>
-          <w:szCs w:val="22"/>
-        </w:rPr>
         <w:t>Enfin, en cas de mise en vente des Locaux Loués ou de l’Immeuble, le Preneur devra laisser visiter les Locaux Loués par les candidats acquéreurs, accompagnés du Bailleur ou de son mandataire, tous les jours ouvrables, étant toutefois entendu que, dans la mesure du possible, il lui sera donné un préavis de 24 heures.</w:t>
       </w:r>
     </w:p>
@@ -11276,7 +11311,27 @@
           <w:sz w:val="22"/>
           <w:szCs w:val="22"/>
         </w:rPr>
-        <w:t xml:space="preserve">Le chiffre d’affaires comprend notamment les ventes ou services résultant de commandes donnés ou reçus dans les Locaux, dont notamment le chiffre d’affaires généré par les ventes « click and collect », quel que soit le lieu d’exécution et notamment en cas de livraison à domicile : il comprendra également les ventes à crédit dont le montant total sera considéré comme ayant été réalisé à la date où le crédit est accordé, et ce, quel que soit le sort de l’encaissement. </w:t>
+        <w:t xml:space="preserve">Le chiffre d’affaires comprend notamment les ventes ou services résultant de commandes donnés ou reçus dans les Locaux, dont notamment le chiffre d’affaires généré par les ventes « click and </w:t>
+      </w:r>
+      <w:proofErr w:type="spellStart"/>
+      <w:r>
+        <w:rPr>
+          <w:rFonts w:ascii="Calibri" w:hAnsi="Calibri" w:cs="Calibri"/>
+          <w:color w:val="000000"/>
+          <w:sz w:val="22"/>
+          <w:szCs w:val="22"/>
+        </w:rPr>
+        <w:t>collect</w:t>
+      </w:r>
+      <w:proofErr w:type="spellEnd"/>
+      <w:r>
+        <w:rPr>
+          <w:rFonts w:ascii="Calibri" w:hAnsi="Calibri" w:cs="Calibri"/>
+          <w:color w:val="000000"/>
+          <w:sz w:val="22"/>
+          <w:szCs w:val="22"/>
+        </w:rPr>
+        <w:t xml:space="preserve"> », quel que soit le lieu d’exécution et notamment en cas de livraison à domicile : il comprendra également les ventes à crédit dont le montant total sera considéré comme ayant été réalisé à la date où le crédit est accordé, et ce, quel que soit le sort de l’encaissement. </w:t>
       </w:r>
     </w:p>
     <w:p>
@@ -11316,82 +11371,82 @@
           <w:sz w:val="22"/>
           <w:szCs w:val="22"/>
         </w:rPr>
+        <w:t xml:space="preserve">5.9. </w:t>
+      </w:r>
+      <w:r>
+        <w:rPr>
+          <w:rFonts w:ascii="Calibri" w:hAnsi="Calibri" w:cs="Calibri"/>
+          <w:b/>
+          <w:sz w:val="22"/>
+          <w:szCs w:val="22"/>
+        </w:rPr>
+        <w:t>–</w:t>
+      </w:r>
+      <w:r>
+        <w:rPr>
+          <w:rFonts w:ascii="Calibri" w:hAnsi="Calibri" w:cs="Calibri"/>
+          <w:b/>
+          <w:sz w:val="22"/>
+          <w:szCs w:val="22"/>
+        </w:rPr>
+        <w:t xml:space="preserve"> Travaux du Preneur</w:t>
+      </w:r>
+      <w:bookmarkEnd w:id="21"/>
+    </w:p>
+    <w:p>
+      <w:pPr>
+        <w:jc w:val="both"/>
+        <w:rPr>
+          <w:rFonts w:ascii="Calibri" w:hAnsi="Calibri" w:cs="Calibri"/>
+          <w:sz w:val="22"/>
+          <w:szCs w:val="22"/>
+        </w:rPr>
+      </w:pPr>
+    </w:p>
+    <w:p>
+      <w:pPr>
+        <w:jc w:val="both"/>
+        <w:rPr>
+          <w:rFonts w:ascii="Calibri" w:hAnsi="Calibri" w:cs="Calibri"/>
+          <w:sz w:val="22"/>
+          <w:szCs w:val="22"/>
+        </w:rPr>
+      </w:pPr>
+      <w:r>
+        <w:rPr>
+          <w:rFonts w:ascii="Calibri" w:hAnsi="Calibri" w:cs="Calibri"/>
+          <w:sz w:val="22"/>
+          <w:szCs w:val="22"/>
+        </w:rPr>
+        <w:t xml:space="preserve">Le Preneur ne pourra effectuer dans les Locaux Loués aucun changement de distribution, aucune démolition, aucun percement de mur, aucune construction, aucune création ou suppression de surfaces, et plus généralement aucune modification des installations d'origine de même qu’aucune intervention en façade des Locaux Loués, sans le consentement préalable et par écrit du Bailleur et le cas échéant de l’entité en charge de l’Immeuble à qui les descriptifs et les plans devront être préalablement soumis. </w:t>
+      </w:r>
+    </w:p>
+    <w:p>
+      <w:pPr>
+        <w:jc w:val="both"/>
+        <w:rPr>
+          <w:rFonts w:ascii="Calibri" w:hAnsi="Calibri" w:cs="Calibri"/>
+          <w:sz w:val="22"/>
+          <w:szCs w:val="22"/>
+        </w:rPr>
+      </w:pPr>
+    </w:p>
+    <w:p>
+      <w:pPr>
+        <w:jc w:val="both"/>
+        <w:rPr>
+          <w:rFonts w:ascii="Calibri" w:hAnsi="Calibri" w:cs="Calibri"/>
+          <w:sz w:val="22"/>
+          <w:szCs w:val="22"/>
+        </w:rPr>
+      </w:pPr>
+      <w:r>
+        <w:rPr>
+          <w:rFonts w:ascii="Calibri" w:hAnsi="Calibri" w:cs="Calibri"/>
+          <w:sz w:val="22"/>
+          <w:szCs w:val="22"/>
+        </w:rPr>
         <w:lastRenderedPageBreak/>
-        <w:t xml:space="preserve">5.9. </w:t>
-      </w:r>
-      <w:r>
-        <w:rPr>
-          <w:rFonts w:ascii="Calibri" w:hAnsi="Calibri" w:cs="Calibri"/>
-          <w:b/>
-          <w:sz w:val="22"/>
-          <w:szCs w:val="22"/>
-        </w:rPr>
-        <w:t>–</w:t>
-      </w:r>
-      <w:r>
-        <w:rPr>
-          <w:rFonts w:ascii="Calibri" w:hAnsi="Calibri" w:cs="Calibri"/>
-          <w:b/>
-          <w:sz w:val="22"/>
-          <w:szCs w:val="22"/>
-        </w:rPr>
-        <w:t xml:space="preserve"> Travaux du Preneur</w:t>
-      </w:r>
-      <w:bookmarkEnd w:id="21"/>
-    </w:p>
-    <w:p>
-      <w:pPr>
-        <w:jc w:val="both"/>
-        <w:rPr>
-          <w:rFonts w:ascii="Calibri" w:hAnsi="Calibri" w:cs="Calibri"/>
-          <w:sz w:val="22"/>
-          <w:szCs w:val="22"/>
-        </w:rPr>
-      </w:pPr>
-    </w:p>
-    <w:p>
-      <w:pPr>
-        <w:jc w:val="both"/>
-        <w:rPr>
-          <w:rFonts w:ascii="Calibri" w:hAnsi="Calibri" w:cs="Calibri"/>
-          <w:sz w:val="22"/>
-          <w:szCs w:val="22"/>
-        </w:rPr>
-      </w:pPr>
-      <w:r>
-        <w:rPr>
-          <w:rFonts w:ascii="Calibri" w:hAnsi="Calibri" w:cs="Calibri"/>
-          <w:sz w:val="22"/>
-          <w:szCs w:val="22"/>
-        </w:rPr>
-        <w:t xml:space="preserve">Le Preneur ne pourra effectuer dans les Locaux Loués aucun changement de distribution, aucune démolition, aucun percement de mur, aucune construction, aucune création ou suppression de surfaces, et plus généralement aucune modification des installations d'origine de même qu’aucune intervention en façade des Locaux Loués, sans le consentement préalable et par écrit du Bailleur et le cas échéant de l’entité en charge de l’Immeuble à qui les descriptifs et les plans devront être préalablement soumis. </w:t>
-      </w:r>
-    </w:p>
-    <w:p>
-      <w:pPr>
-        <w:jc w:val="both"/>
-        <w:rPr>
-          <w:rFonts w:ascii="Calibri" w:hAnsi="Calibri" w:cs="Calibri"/>
-          <w:sz w:val="22"/>
-          <w:szCs w:val="22"/>
-        </w:rPr>
-      </w:pPr>
-    </w:p>
-    <w:p>
-      <w:pPr>
-        <w:jc w:val="both"/>
-        <w:rPr>
-          <w:rFonts w:ascii="Calibri" w:hAnsi="Calibri" w:cs="Calibri"/>
-          <w:sz w:val="22"/>
-          <w:szCs w:val="22"/>
-        </w:rPr>
-      </w:pPr>
-      <w:r>
-        <w:rPr>
-          <w:rFonts w:ascii="Calibri" w:hAnsi="Calibri" w:cs="Calibri"/>
-          <w:sz w:val="22"/>
-          <w:szCs w:val="22"/>
-        </w:rPr>
         <w:t xml:space="preserve">De manière générale, tous </w:t>
       </w:r>
       <w:r>
@@ -11862,7 +11917,6 @@
           <w:sz w:val="22"/>
           <w:szCs w:val="22"/>
         </w:rPr>
-        <w:lastRenderedPageBreak/>
         <w:t xml:space="preserve">Enfin, le Preneur s’engage à effectuer à ses frais et sous sa responsabilité exclusive tous autres travaux, devant lui permettre d’utiliser les Locaux Loués conformément à leur destination, quand bien même il s’agirait de travaux de conformité avec la réglementation sur l’hygiène, la sécurité, l’accessibilité ou la réglementation du travail, ou de mises aux normes. </w:t>
       </w:r>
     </w:p>
@@ -11943,6 +11997,7 @@
           <w:sz w:val="22"/>
           <w:szCs w:val="22"/>
         </w:rPr>
+        <w:lastRenderedPageBreak/>
         <w:t>O</w:t>
       </w:r>
       <w:r>
@@ -12338,7 +12393,6 @@
           <w:sz w:val="22"/>
           <w:szCs w:val="22"/>
         </w:rPr>
-        <w:lastRenderedPageBreak/>
         <w:t>une</w:t>
       </w:r>
       <w:proofErr w:type="gramEnd"/>
@@ -12384,7 +12438,18 @@
           <w:sz w:val="22"/>
           <w:szCs w:val="22"/>
         </w:rPr>
-        <w:t>Le Preneur devra demander à chaque intervenant titulaire d'un marché de travaux ou d'un contrat de prestations, de justifier de toute assurance inhérente aux travaux à réaliser (notamment responsabilité civile et décennale). Le Preneur s'engage à fournir au Bailleur, après la réalisation des travaux, pour lui-même et l'ensemble des intervenants visés ci-dessus, une copie certifiée conforme de ces polices ou, à défaut, les notes de couverture émises par les compagnies d'assurances, attestant du paiement des primes dues. En outre, jusqu'au jour de l'obtention de l'attestation de non-contestation de la conformité visée à l'article R.462-10 du Code de l'urbanisme, le Preneur ne pourra effectuer ou faire effectuer quelques travaux que ce soit susceptibles de mettre obstacle à la délivrance de ladite attestation.</w:t>
+        <w:t xml:space="preserve">Le Preneur devra demander à chaque intervenant titulaire d'un marché de travaux ou d'un contrat de prestations, de justifier de toute assurance inhérente aux travaux à réaliser (notamment responsabilité civile et décennale). Le Preneur s'engage à fournir au Bailleur, après la réalisation des travaux, pour lui-même et l'ensemble des intervenants visés ci-dessus, une copie certifiée conforme de ces polices ou, à défaut, les notes de couverture émises par les compagnies d'assurances, attestant du paiement des primes dues. En outre, jusqu'au jour de l'obtention de l'attestation de non-contestation de la conformité visée à l'article R.462-10 du Code de l'urbanisme, le Preneur ne pourra </w:t>
+      </w:r>
+      <w:r>
+        <w:rPr>
+          <w:rFonts w:ascii="Calibri" w:hAnsi="Calibri" w:cs="Calibri"/>
+          <w:bCs/>
+          <w:iCs/>
+          <w:sz w:val="22"/>
+          <w:szCs w:val="22"/>
+        </w:rPr>
+        <w:lastRenderedPageBreak/>
+        <w:t>effectuer ou faire effectuer quelques travaux que ce soit susceptibles de mettre obstacle à la délivrance de ladite attestation.</w:t>
       </w:r>
     </w:p>
     <w:p>
@@ -13983,7 +14048,7 @@
           <w:szCs w:val="22"/>
           <w:shd w:val="clear" w:color="auto" w:fill="FFFFFF"/>
         </w:rPr>
-        <w:t xml:space="preserve">leur ou </w:t>
+        <w:t xml:space="preserve">leur ou encore les </w:t>
       </w:r>
       <w:r>
         <w:rPr>
@@ -13993,7 +14058,7 @@
           <w:shd w:val="clear" w:color="auto" w:fill="FFFFFF"/>
         </w:rPr>
         <w:lastRenderedPageBreak/>
-        <w:t xml:space="preserve">encore les éventuelles franchises de loyer consenties par le </w:t>
+        <w:t xml:space="preserve">éventuelles franchises de loyer consenties par le </w:t>
       </w:r>
       <w:r>
         <w:rPr>
@@ -15898,6 +15963,7 @@
           <w:sz w:val="22"/>
           <w:szCs w:val="22"/>
         </w:rPr>
+        <w:lastRenderedPageBreak/>
         <w:t xml:space="preserve">Il est précisé que l’inventaire ne saurait constituer pour le </w:t>
       </w:r>
       <w:r>
@@ -17010,6 +17076,7 @@
           <w:sz w:val="22"/>
           <w:szCs w:val="22"/>
         </w:rPr>
+        <w:lastRenderedPageBreak/>
         <w:t>L</w:t>
       </w:r>
       <w:r>
@@ -18702,6 +18769,7 @@
           <w:sz w:val="22"/>
           <w:szCs w:val="22"/>
         </w:rPr>
+        <w:lastRenderedPageBreak/>
         <w:t xml:space="preserve">Aucune cession ne pourra valablement intervenir sans paiement préalable ou simultané par le cédant au </w:t>
       </w:r>
       <w:r>
@@ -20441,7 +20509,6 @@
           <w:sz w:val="22"/>
           <w:szCs w:val="22"/>
         </w:rPr>
-        <w:lastRenderedPageBreak/>
         <w:t xml:space="preserve">Loués </w:t>
       </w:r>
       <w:r>
@@ -21808,95 +21875,95 @@
           <w:sz w:val="22"/>
           <w:szCs w:val="22"/>
         </w:rPr>
+        <w:t>les</w:t>
+      </w:r>
+      <w:proofErr w:type="gramEnd"/>
+      <w:r>
+        <w:rPr>
+          <w:rFonts w:ascii="Calibri" w:hAnsi="Calibri" w:cs="Calibri"/>
+          <w:bCs/>
+          <w:sz w:val="22"/>
+          <w:szCs w:val="22"/>
+        </w:rPr>
+        <w:t xml:space="preserve"> honoraires d’expert.</w:t>
+      </w:r>
+    </w:p>
+    <w:p>
+      <w:pPr>
+        <w:jc w:val="both"/>
+        <w:rPr>
+          <w:rFonts w:ascii="Calibri" w:hAnsi="Calibri" w:cs="Calibri"/>
+          <w:bCs/>
+          <w:sz w:val="22"/>
+          <w:szCs w:val="22"/>
+        </w:rPr>
+      </w:pPr>
+      <w:r>
+        <w:rPr>
+          <w:rFonts w:ascii="Calibri" w:hAnsi="Calibri" w:cs="Calibri"/>
+          <w:bCs/>
+          <w:sz w:val="22"/>
+          <w:szCs w:val="22"/>
+        </w:rPr>
+        <w:t>b</w:t>
+      </w:r>
+      <w:r>
+        <w:rPr>
+          <w:rFonts w:ascii="Calibri" w:hAnsi="Calibri" w:cs="Calibri"/>
+          <w:bCs/>
+          <w:sz w:val="22"/>
+          <w:szCs w:val="22"/>
+        </w:rPr>
+        <w:t>) sa privation de jouissance, à due concurrence de deux années et ses pertes d’exploitation</w:t>
+      </w:r>
+    </w:p>
+    <w:p>
+      <w:pPr>
+        <w:jc w:val="both"/>
+        <w:rPr>
+          <w:rFonts w:ascii="Calibri" w:hAnsi="Calibri" w:cs="Calibri"/>
+          <w:bCs/>
+          <w:sz w:val="22"/>
+          <w:szCs w:val="22"/>
+        </w:rPr>
+      </w:pPr>
+      <w:r>
+        <w:rPr>
+          <w:rFonts w:ascii="Calibri" w:hAnsi="Calibri" w:cs="Calibri"/>
+          <w:bCs/>
+          <w:sz w:val="22"/>
+          <w:szCs w:val="22"/>
+        </w:rPr>
+        <w:t>c</w:t>
+      </w:r>
+      <w:r>
+        <w:rPr>
+          <w:rFonts w:ascii="Calibri" w:hAnsi="Calibri" w:cs="Calibri"/>
+          <w:bCs/>
+          <w:sz w:val="22"/>
+          <w:szCs w:val="22"/>
+        </w:rPr>
+        <w:t>) le recours des voisins et des tiers</w:t>
+      </w:r>
+    </w:p>
+    <w:p>
+      <w:pPr>
+        <w:jc w:val="both"/>
+        <w:rPr>
+          <w:rFonts w:ascii="Calibri" w:hAnsi="Calibri" w:cs="Calibri"/>
+          <w:bCs/>
+          <w:sz w:val="22"/>
+          <w:szCs w:val="22"/>
+        </w:rPr>
+      </w:pPr>
+      <w:r>
+        <w:rPr>
+          <w:rFonts w:ascii="Calibri" w:hAnsi="Calibri" w:cs="Calibri"/>
+          <w:bCs/>
+          <w:sz w:val="22"/>
+          <w:szCs w:val="22"/>
+        </w:rPr>
         <w:lastRenderedPageBreak/>
-        <w:t>les</w:t>
-      </w:r>
-      <w:proofErr w:type="gramEnd"/>
-      <w:r>
-        <w:rPr>
-          <w:rFonts w:ascii="Calibri" w:hAnsi="Calibri" w:cs="Calibri"/>
-          <w:bCs/>
-          <w:sz w:val="22"/>
-          <w:szCs w:val="22"/>
-        </w:rPr>
-        <w:t xml:space="preserve"> honoraires d’expert.</w:t>
-      </w:r>
-    </w:p>
-    <w:p>
-      <w:pPr>
-        <w:jc w:val="both"/>
-        <w:rPr>
-          <w:rFonts w:ascii="Calibri" w:hAnsi="Calibri" w:cs="Calibri"/>
-          <w:bCs/>
-          <w:sz w:val="22"/>
-          <w:szCs w:val="22"/>
-        </w:rPr>
-      </w:pPr>
-      <w:r>
-        <w:rPr>
-          <w:rFonts w:ascii="Calibri" w:hAnsi="Calibri" w:cs="Calibri"/>
-          <w:bCs/>
-          <w:sz w:val="22"/>
-          <w:szCs w:val="22"/>
-        </w:rPr>
-        <w:t>b</w:t>
-      </w:r>
-      <w:r>
-        <w:rPr>
-          <w:rFonts w:ascii="Calibri" w:hAnsi="Calibri" w:cs="Calibri"/>
-          <w:bCs/>
-          <w:sz w:val="22"/>
-          <w:szCs w:val="22"/>
-        </w:rPr>
-        <w:t>) sa privation de jouissance, à due concurrence de deux années et ses pertes d’exploitation</w:t>
-      </w:r>
-    </w:p>
-    <w:p>
-      <w:pPr>
-        <w:jc w:val="both"/>
-        <w:rPr>
-          <w:rFonts w:ascii="Calibri" w:hAnsi="Calibri" w:cs="Calibri"/>
-          <w:bCs/>
-          <w:sz w:val="22"/>
-          <w:szCs w:val="22"/>
-        </w:rPr>
-      </w:pPr>
-      <w:r>
-        <w:rPr>
-          <w:rFonts w:ascii="Calibri" w:hAnsi="Calibri" w:cs="Calibri"/>
-          <w:bCs/>
-          <w:sz w:val="22"/>
-          <w:szCs w:val="22"/>
-        </w:rPr>
-        <w:t>c</w:t>
-      </w:r>
-      <w:r>
-        <w:rPr>
-          <w:rFonts w:ascii="Calibri" w:hAnsi="Calibri" w:cs="Calibri"/>
-          <w:bCs/>
-          <w:sz w:val="22"/>
-          <w:szCs w:val="22"/>
-        </w:rPr>
-        <w:t>) le recours des voisins et des tiers</w:t>
-      </w:r>
-    </w:p>
-    <w:p>
-      <w:pPr>
-        <w:jc w:val="both"/>
-        <w:rPr>
-          <w:rFonts w:ascii="Calibri" w:hAnsi="Calibri" w:cs="Calibri"/>
-          <w:bCs/>
-          <w:sz w:val="22"/>
-          <w:szCs w:val="22"/>
-        </w:rPr>
-      </w:pPr>
-      <w:r>
-        <w:rPr>
-          <w:rFonts w:ascii="Calibri" w:hAnsi="Calibri" w:cs="Calibri"/>
-          <w:bCs/>
-          <w:sz w:val="22"/>
-          <w:szCs w:val="22"/>
-        </w:rPr>
         <w:t>d</w:t>
       </w:r>
       <w:r>
@@ -22565,57 +22632,57 @@
           <w:sz w:val="22"/>
           <w:szCs w:val="22"/>
         </w:rPr>
-        <w:t xml:space="preserve">, une attestation d’assurance reprenant les garanties </w:t>
-      </w:r>
-      <w:r>
+        <w:t>, une attestation d’assurance reprenant les garanties demandées ci-dessus. Pendant la durée du Bail, il devra justifier de la validité des contrats à toute réquisition du Bailleur.</w:t>
+      </w:r>
+    </w:p>
+    <w:p>
+      <w:pPr>
+        <w:jc w:val="both"/>
         <w:rPr>
           <w:rFonts w:ascii="Calibri" w:hAnsi="Calibri" w:cs="Calibri"/>
           <w:bCs/>
           <w:sz w:val="22"/>
           <w:szCs w:val="22"/>
         </w:rPr>
+      </w:pPr>
+      <w:r>
+        <w:rPr>
+          <w:rFonts w:ascii="Calibri" w:hAnsi="Calibri" w:cs="Calibri"/>
+          <w:bCs/>
+          <w:sz w:val="22"/>
+          <w:szCs w:val="22"/>
+        </w:rPr>
+        <w:t xml:space="preserve">Le Preneur devra déléguer et transférer au Bailleur le bénéfice desdites assurances, </w:t>
+      </w:r>
+      <w:proofErr w:type="gramStart"/>
+      <w:r>
+        <w:rPr>
+          <w:rFonts w:ascii="Calibri" w:hAnsi="Calibri" w:cs="Calibri"/>
+          <w:bCs/>
+          <w:sz w:val="22"/>
+          <w:szCs w:val="22"/>
+        </w:rPr>
+        <w:t>de manière à ce</w:t>
+      </w:r>
+      <w:proofErr w:type="gramEnd"/>
+      <w:r>
+        <w:rPr>
+          <w:rFonts w:ascii="Calibri" w:hAnsi="Calibri" w:cs="Calibri"/>
+          <w:bCs/>
+          <w:sz w:val="22"/>
+          <w:szCs w:val="22"/>
+        </w:rPr>
+        <w:t xml:space="preserve"> que toutes indemnités dues au Preneur par toute compagnie d'assurances, en cas de sinistre et pour </w:t>
+      </w:r>
+      <w:r>
+        <w:rPr>
+          <w:rFonts w:ascii="Calibri" w:hAnsi="Calibri" w:cs="Calibri"/>
+          <w:bCs/>
+          <w:sz w:val="22"/>
+          <w:szCs w:val="22"/>
+        </w:rPr>
         <w:lastRenderedPageBreak/>
-        <w:t>demandées ci-dessus. Pendant la durée du Bail, il devra justifier de la validité des contrats à toute réquisition du Bailleur.</w:t>
-      </w:r>
-    </w:p>
-    <w:p>
-      <w:pPr>
-        <w:jc w:val="both"/>
-        <w:rPr>
-          <w:rFonts w:ascii="Calibri" w:hAnsi="Calibri" w:cs="Calibri"/>
-          <w:bCs/>
-          <w:sz w:val="22"/>
-          <w:szCs w:val="22"/>
-        </w:rPr>
-      </w:pPr>
-      <w:r>
-        <w:rPr>
-          <w:rFonts w:ascii="Calibri" w:hAnsi="Calibri" w:cs="Calibri"/>
-          <w:bCs/>
-          <w:sz w:val="22"/>
-          <w:szCs w:val="22"/>
-        </w:rPr>
-        <w:t xml:space="preserve">Le Preneur devra déléguer et transférer au Bailleur le bénéfice desdites assurances, </w:t>
-      </w:r>
-      <w:proofErr w:type="gramStart"/>
-      <w:r>
-        <w:rPr>
-          <w:rFonts w:ascii="Calibri" w:hAnsi="Calibri" w:cs="Calibri"/>
-          <w:bCs/>
-          <w:sz w:val="22"/>
-          <w:szCs w:val="22"/>
-        </w:rPr>
-        <w:t>de manière à ce</w:t>
-      </w:r>
-      <w:proofErr w:type="gramEnd"/>
-      <w:r>
-        <w:rPr>
-          <w:rFonts w:ascii="Calibri" w:hAnsi="Calibri" w:cs="Calibri"/>
-          <w:bCs/>
-          <w:sz w:val="22"/>
-          <w:szCs w:val="22"/>
-        </w:rPr>
-        <w:t xml:space="preserve"> que toutes indemnités dues au Preneur par toute compagnie d'assurances, en cas de sinistre et pour quelque cause que ce soit, soient affectées au privilège du Bailleur à concurrence de toutes sommes dues, échues ou à échoir. </w:t>
+        <w:t xml:space="preserve">quelque cause que ce soit, soient affectées au privilège du Bailleur à concurrence de toutes sommes dues, échues ou à échoir. </w:t>
       </w:r>
     </w:p>
     <w:p>
@@ -23317,6 +23384,7 @@
           <w:sz w:val="22"/>
           <w:szCs w:val="22"/>
         </w:rPr>
+        <w:lastRenderedPageBreak/>
         <w:t>Dans le cas où une quelconque procédure collective serait ouverte à l’encontre du Preneur, ce dernier devra, dans un délai de quinze (15) jours à compter du jugement d’ouverture de ladite procédure collective, en informer le Bailleur par lettre recommandée avec accusé de réception.</w:t>
       </w:r>
     </w:p>
@@ -23807,71 +23875,79 @@
           <w:sz w:val="22"/>
           <w:szCs w:val="22"/>
         </w:rPr>
+        <w:t>De convention expresse, cette pénalité s’appliquera de plein droit à l’expiration du délai mentionné ci-dessus sans qu’il y ait lieu de notifier une quelconque mise en demeure.</w:t>
+      </w:r>
+    </w:p>
+    <w:p>
+      <w:pPr>
+        <w:jc w:val="both"/>
+        <w:rPr>
+          <w:rFonts w:ascii="Calibri" w:hAnsi="Calibri" w:cs="Calibri"/>
+          <w:sz w:val="22"/>
+          <w:szCs w:val="22"/>
+        </w:rPr>
+      </w:pPr>
+    </w:p>
+    <w:p>
+      <w:pPr>
+        <w:jc w:val="both"/>
+        <w:rPr>
+          <w:rFonts w:ascii="Calibri" w:hAnsi="Calibri" w:cs="Calibri"/>
+          <w:sz w:val="22"/>
+          <w:szCs w:val="22"/>
+        </w:rPr>
+      </w:pPr>
+      <w:r>
+        <w:rPr>
+          <w:rFonts w:ascii="Calibri" w:hAnsi="Calibri" w:cs="Calibri"/>
+          <w:sz w:val="22"/>
+          <w:szCs w:val="22"/>
+        </w:rPr>
+        <w:t xml:space="preserve">En outre, toute somme due en vertu du présent Bail qui ne serait pas payée à son échéance exacte, porterait intérêt au taux de l’intérêt légal conformément à </w:t>
+      </w:r>
+      <w:r>
+        <w:rPr>
+          <w:rFonts w:ascii="Calibri" w:hAnsi="Calibri" w:cs="Calibri"/>
+          <w:sz w:val="22"/>
+          <w:szCs w:val="22"/>
+          <w:highlight w:val="yellow"/>
+        </w:rPr>
+        <w:t>l’</w:t>
+      </w:r>
+      <w:r>
+        <w:rPr>
+          <w:rFonts w:ascii="Calibri" w:hAnsi="Calibri" w:cs="Calibri"/>
+          <w:sz w:val="22"/>
+          <w:szCs w:val="22"/>
+          <w:highlight w:val="yellow"/>
+        </w:rPr>
+        <w:t>A</w:t>
+      </w:r>
+      <w:r>
+        <w:rPr>
+          <w:rFonts w:ascii="Calibri" w:hAnsi="Calibri" w:cs="Calibri"/>
+          <w:sz w:val="22"/>
+          <w:szCs w:val="22"/>
+          <w:highlight w:val="yellow"/>
+        </w:rPr>
+        <w:t>rticle 10</w:t>
+      </w:r>
+      <w:r>
+        <w:rPr>
+          <w:rFonts w:ascii="Calibri" w:hAnsi="Calibri" w:cs="Calibri"/>
+          <w:sz w:val="22"/>
+          <w:szCs w:val="22"/>
+        </w:rPr>
+        <w:t xml:space="preserve"> du présent Bail, sans qu’aucune </w:t>
+      </w:r>
+      <w:r>
+        <w:rPr>
+          <w:rFonts w:ascii="Calibri" w:hAnsi="Calibri" w:cs="Calibri"/>
+          <w:sz w:val="22"/>
+          <w:szCs w:val="22"/>
+        </w:rPr>
         <w:lastRenderedPageBreak/>
-        <w:t>De convention expresse, cette pénalité s’appliquera de plein droit à l’expiration du délai mentionné ci-dessus sans qu’il y ait lieu de notifier une quelconque mise en demeure.</w:t>
-      </w:r>
-    </w:p>
-    <w:p>
-      <w:pPr>
-        <w:jc w:val="both"/>
-        <w:rPr>
-          <w:rFonts w:ascii="Calibri" w:hAnsi="Calibri" w:cs="Calibri"/>
-          <w:sz w:val="22"/>
-          <w:szCs w:val="22"/>
-        </w:rPr>
-      </w:pPr>
-    </w:p>
-    <w:p>
-      <w:pPr>
-        <w:jc w:val="both"/>
-        <w:rPr>
-          <w:rFonts w:ascii="Calibri" w:hAnsi="Calibri" w:cs="Calibri"/>
-          <w:sz w:val="22"/>
-          <w:szCs w:val="22"/>
-        </w:rPr>
-      </w:pPr>
-      <w:r>
-        <w:rPr>
-          <w:rFonts w:ascii="Calibri" w:hAnsi="Calibri" w:cs="Calibri"/>
-          <w:sz w:val="22"/>
-          <w:szCs w:val="22"/>
-        </w:rPr>
-        <w:t xml:space="preserve">En outre, toute somme due en vertu du présent Bail qui ne serait pas payée à son échéance exacte, porterait intérêt au taux de l’intérêt légal conformément à </w:t>
-      </w:r>
-      <w:r>
-        <w:rPr>
-          <w:rFonts w:ascii="Calibri" w:hAnsi="Calibri" w:cs="Calibri"/>
-          <w:sz w:val="22"/>
-          <w:szCs w:val="22"/>
-          <w:highlight w:val="yellow"/>
-        </w:rPr>
-        <w:t>l’</w:t>
-      </w:r>
-      <w:r>
-        <w:rPr>
-          <w:rFonts w:ascii="Calibri" w:hAnsi="Calibri" w:cs="Calibri"/>
-          <w:sz w:val="22"/>
-          <w:szCs w:val="22"/>
-          <w:highlight w:val="yellow"/>
-        </w:rPr>
-        <w:t>A</w:t>
-      </w:r>
-      <w:r>
-        <w:rPr>
-          <w:rFonts w:ascii="Calibri" w:hAnsi="Calibri" w:cs="Calibri"/>
-          <w:sz w:val="22"/>
-          <w:szCs w:val="22"/>
-          <w:highlight w:val="yellow"/>
-        </w:rPr>
-        <w:t>rticle 10</w:t>
-      </w:r>
-      <w:r>
-        <w:rPr>
-          <w:rFonts w:ascii="Calibri" w:hAnsi="Calibri" w:cs="Calibri"/>
-          <w:sz w:val="22"/>
-          <w:szCs w:val="22"/>
-        </w:rPr>
-        <w:t xml:space="preserve"> du présent Bail, sans qu’aucune mise en demeure préalable ne soit nécessaire, le Preneur se trouvant en demeure par le seul effet de la survenance du terme.</w:t>
+        <w:t>mise en demeure préalable ne soit nécessaire, le Preneur se trouvant en demeure par le seul effet de la survenance du terme.</w:t>
       </w:r>
     </w:p>
     <w:p>
@@ -25703,8 +25779,70 @@
           <w:sz w:val="22"/>
           <w:szCs w:val="22"/>
         </w:rPr>
-        <w:t xml:space="preserve">Dans le cadre du Bail, les parties s’engagent à respecter l’ensemble des obligations légales et règlementaires actuelles et futures relatives à la lutte contre le blanchiment des capitaux et le </w:t>
-      </w:r>
+        <w:t>Dans le cadre du Bail, les parties s’engagent à respecter l’ensemble des obligations légales et règlementaires actuelles et futures relatives à la lutte contre le blanchiment des capitaux et le financement des activités terroristes et plus particulièrement les dispositions du Code monétaire et financier et notamment des articles L. 561-1 et suivants dudit Code.</w:t>
+      </w:r>
+    </w:p>
+    <w:p>
+      <w:pPr>
+        <w:jc w:val="both"/>
+        <w:rPr>
+          <w:rFonts w:ascii="Calibri" w:hAnsi="Calibri" w:cs="Calibri"/>
+          <w:sz w:val="22"/>
+          <w:szCs w:val="22"/>
+        </w:rPr>
+      </w:pPr>
+    </w:p>
+    <w:p>
+      <w:pPr>
+        <w:jc w:val="both"/>
+        <w:rPr>
+          <w:rFonts w:ascii="Calibri" w:hAnsi="Calibri" w:cs="Calibri"/>
+          <w:sz w:val="22"/>
+          <w:szCs w:val="22"/>
+        </w:rPr>
+      </w:pPr>
+    </w:p>
+    <w:p>
+      <w:pPr>
+        <w:pStyle w:val="Titre2"/>
+      </w:pPr>
+      <w:bookmarkStart w:id="63" w:name="_Toc176798891"/>
+      <w:r>
+        <w:t xml:space="preserve">ARTICLE </w:t>
+      </w:r>
+      <w:r>
+        <w:t>2</w:t>
+      </w:r>
+      <w:r>
+        <w:t>4</w:t>
+      </w:r>
+      <w:r>
+        <w:t xml:space="preserve"> </w:t>
+      </w:r>
+      <w:r>
+        <w:t>– ELECTION DE DOMICILE</w:t>
+      </w:r>
+      <w:bookmarkEnd w:id="63"/>
+    </w:p>
+    <w:p>
+      <w:pPr>
+        <w:jc w:val="both"/>
+        <w:rPr>
+          <w:rFonts w:ascii="Calibri" w:hAnsi="Calibri" w:cs="Calibri"/>
+          <w:sz w:val="22"/>
+          <w:szCs w:val="22"/>
+        </w:rPr>
+      </w:pPr>
+    </w:p>
+    <w:p>
+      <w:pPr>
+        <w:jc w:val="both"/>
+        <w:rPr>
+          <w:rFonts w:ascii="Calibri" w:hAnsi="Calibri" w:cs="Calibri"/>
+          <w:sz w:val="22"/>
+          <w:szCs w:val="22"/>
+        </w:rPr>
+      </w:pPr>
       <w:r>
         <w:rPr>
           <w:rFonts w:ascii="Calibri" w:hAnsi="Calibri" w:cs="Calibri"/>
@@ -25712,76 +25850,6 @@
           <w:szCs w:val="22"/>
         </w:rPr>
         <w:lastRenderedPageBreak/>
-        <w:t>financement des activités terroristes et plus particulièrement les dispositions du Code monétaire et financier et notamment des articles L. 561-1 et suivants dudit Code.</w:t>
-      </w:r>
-    </w:p>
-    <w:p>
-      <w:pPr>
-        <w:jc w:val="both"/>
-        <w:rPr>
-          <w:rFonts w:ascii="Calibri" w:hAnsi="Calibri" w:cs="Calibri"/>
-          <w:sz w:val="22"/>
-          <w:szCs w:val="22"/>
-        </w:rPr>
-      </w:pPr>
-    </w:p>
-    <w:p>
-      <w:pPr>
-        <w:jc w:val="both"/>
-        <w:rPr>
-          <w:rFonts w:ascii="Calibri" w:hAnsi="Calibri" w:cs="Calibri"/>
-          <w:sz w:val="22"/>
-          <w:szCs w:val="22"/>
-        </w:rPr>
-      </w:pPr>
-    </w:p>
-    <w:p>
-      <w:pPr>
-        <w:pStyle w:val="Titre2"/>
-      </w:pPr>
-      <w:bookmarkStart w:id="63" w:name="_Toc176798891"/>
-      <w:r>
-        <w:t xml:space="preserve">ARTICLE </w:t>
-      </w:r>
-      <w:r>
-        <w:t>2</w:t>
-      </w:r>
-      <w:r>
-        <w:t>4</w:t>
-      </w:r>
-      <w:r>
-        <w:t xml:space="preserve"> </w:t>
-      </w:r>
-      <w:r>
-        <w:t>– ELECTION DE DOMICILE</w:t>
-      </w:r>
-      <w:bookmarkEnd w:id="63"/>
-    </w:p>
-    <w:p>
-      <w:pPr>
-        <w:jc w:val="both"/>
-        <w:rPr>
-          <w:rFonts w:ascii="Calibri" w:hAnsi="Calibri" w:cs="Calibri"/>
-          <w:sz w:val="22"/>
-          <w:szCs w:val="22"/>
-        </w:rPr>
-      </w:pPr>
-    </w:p>
-    <w:p>
-      <w:pPr>
-        <w:jc w:val="both"/>
-        <w:rPr>
-          <w:rFonts w:ascii="Calibri" w:hAnsi="Calibri" w:cs="Calibri"/>
-          <w:sz w:val="22"/>
-          <w:szCs w:val="22"/>
-        </w:rPr>
-      </w:pPr>
-      <w:r>
-        <w:rPr>
-          <w:rFonts w:ascii="Calibri" w:hAnsi="Calibri" w:cs="Calibri"/>
-          <w:sz w:val="22"/>
-          <w:szCs w:val="22"/>
-        </w:rPr>
         <w:t xml:space="preserve">Pour l'exécution des présentes, les </w:t>
       </w:r>
       <w:r>
@@ -26450,87 +26518,181 @@
       </w:pPr>
       <w:bookmarkStart w:id="67" w:name="_Toc176798895"/>
       <w:r>
+        <w:t>ARTICLE 2</w:t>
+      </w:r>
+      <w:r>
+        <w:t>6</w:t>
+      </w:r>
+      <w:r>
+        <w:t xml:space="preserve"> – DISPOSITIONS PARTICULIERES</w:t>
+      </w:r>
+      <w:bookmarkEnd w:id="67"/>
+    </w:p>
+    <w:p>
+      <w:pPr>
+        <w:jc w:val="both"/>
+        <w:rPr>
+          <w:rFonts w:ascii="Calibri" w:hAnsi="Calibri" w:cs="Calibri"/>
+          <w:sz w:val="22"/>
+          <w:szCs w:val="22"/>
+        </w:rPr>
+      </w:pPr>
+    </w:p>
+    <w:p>
+      <w:pPr>
+        <w:jc w:val="both"/>
+        <w:rPr>
+          <w:rFonts w:ascii="Calibri" w:hAnsi="Calibri" w:cs="Calibri"/>
+          <w:sz w:val="22"/>
+          <w:szCs w:val="22"/>
+        </w:rPr>
+      </w:pPr>
+      <w:r>
+        <w:rPr>
+          <w:rFonts w:ascii="Calibri" w:hAnsi="Calibri" w:cs="Calibri"/>
+          <w:sz w:val="22"/>
+          <w:szCs w:val="22"/>
+        </w:rPr>
+        <w:t>Les Parties insistent sur le fait que le présent</w:t>
+      </w:r>
+      <w:r>
+        <w:rPr>
+          <w:rFonts w:ascii="Calibri" w:hAnsi="Calibri" w:cs="Calibri"/>
+          <w:sz w:val="22"/>
+          <w:szCs w:val="22"/>
+        </w:rPr>
+        <w:t xml:space="preserve"> Bail</w:t>
+      </w:r>
+      <w:r>
+        <w:rPr>
+          <w:rFonts w:ascii="Calibri" w:hAnsi="Calibri" w:cs="Calibri"/>
+          <w:sz w:val="22"/>
+          <w:szCs w:val="22"/>
+        </w:rPr>
+        <w:t xml:space="preserve"> a fait l’objet de discussions entre elles.</w:t>
+      </w:r>
+    </w:p>
+    <w:p>
+      <w:pPr>
+        <w:jc w:val="both"/>
+        <w:rPr>
+          <w:rFonts w:ascii="Calibri" w:hAnsi="Calibri" w:cs="Calibri"/>
+          <w:sz w:val="22"/>
+          <w:szCs w:val="22"/>
+        </w:rPr>
+      </w:pPr>
+    </w:p>
+    <w:p>
+      <w:pPr>
+        <w:jc w:val="both"/>
+        <w:rPr>
+          <w:rFonts w:ascii="Calibri" w:hAnsi="Calibri" w:cs="Calibri"/>
+          <w:sz w:val="22"/>
+          <w:szCs w:val="22"/>
+        </w:rPr>
+      </w:pPr>
+      <w:r>
+        <w:rPr>
+          <w:rFonts w:ascii="Calibri" w:hAnsi="Calibri" w:cs="Calibri"/>
+          <w:sz w:val="22"/>
+          <w:szCs w:val="22"/>
+        </w:rPr>
+        <w:t xml:space="preserve">C’est dans ces conditions que les Parties ont décidé, au moyen du présent article, de conférer à certaines stipulations du </w:t>
+      </w:r>
+      <w:r>
+        <w:rPr>
+          <w:rFonts w:ascii="Calibri" w:hAnsi="Calibri" w:cs="Calibri"/>
+          <w:sz w:val="22"/>
+          <w:szCs w:val="22"/>
+        </w:rPr>
+        <w:t xml:space="preserve">Bail </w:t>
+      </w:r>
+      <w:r>
+        <w:rPr>
+          <w:rFonts w:ascii="Calibri" w:hAnsi="Calibri" w:cs="Calibri"/>
+          <w:sz w:val="22"/>
+          <w:szCs w:val="22"/>
+        </w:rPr>
+        <w:t>et ce, convention expresse entre elles un caractère « </w:t>
+      </w:r>
+      <w:r>
+        <w:rPr>
+          <w:rFonts w:ascii="Calibri" w:hAnsi="Calibri" w:cs="Calibri"/>
+          <w:i/>
+          <w:sz w:val="22"/>
+          <w:szCs w:val="22"/>
+        </w:rPr>
+        <w:t>intuitu personae</w:t>
+      </w:r>
+      <w:r>
+        <w:rPr>
+          <w:rFonts w:ascii="Calibri" w:hAnsi="Calibri" w:cs="Calibri"/>
+          <w:sz w:val="22"/>
+          <w:szCs w:val="22"/>
+        </w:rPr>
+        <w:t xml:space="preserve"> » au seul profit de la société </w:t>
+      </w:r>
+      <w:r>
+        <w:rPr>
+          <w:rFonts w:ascii="Calibri" w:hAnsi="Calibri" w:cs="Calibri"/>
+          <w:sz w:val="22"/>
+          <w:szCs w:val="22"/>
+          <w:highlight w:val="lightGray"/>
+        </w:rPr>
+        <w:t>XXX</w:t>
+      </w:r>
+      <w:r>
+        <w:rPr>
+          <w:rFonts w:ascii="Calibri" w:hAnsi="Calibri" w:cs="Calibri"/>
+          <w:sz w:val="22"/>
+          <w:szCs w:val="22"/>
+        </w:rPr>
+        <w:t>.</w:t>
+      </w:r>
+    </w:p>
+    <w:p>
+      <w:pPr>
+        <w:jc w:val="both"/>
+        <w:rPr>
+          <w:rFonts w:ascii="Calibri" w:hAnsi="Calibri" w:cs="Calibri"/>
+          <w:sz w:val="22"/>
+          <w:szCs w:val="22"/>
+        </w:rPr>
+      </w:pPr>
+    </w:p>
+    <w:p>
+      <w:pPr>
+        <w:jc w:val="both"/>
+        <w:rPr>
+          <w:rFonts w:ascii="Calibri" w:hAnsi="Calibri" w:cs="Calibri"/>
+          <w:sz w:val="22"/>
+          <w:szCs w:val="22"/>
+        </w:rPr>
+      </w:pPr>
+      <w:r>
+        <w:rPr>
+          <w:rFonts w:ascii="Calibri" w:hAnsi="Calibri" w:cs="Calibri"/>
+          <w:sz w:val="22"/>
+          <w:szCs w:val="22"/>
+        </w:rPr>
         <w:lastRenderedPageBreak/>
-        <w:t>ARTICLE 2</w:t>
-      </w:r>
-      <w:r>
-        <w:t>6</w:t>
-      </w:r>
-      <w:r>
-        <w:t xml:space="preserve"> – DISPOSITIONS PARTICULIERES</w:t>
-      </w:r>
-      <w:bookmarkEnd w:id="67"/>
-    </w:p>
-    <w:p>
-      <w:pPr>
-        <w:jc w:val="both"/>
-        <w:rPr>
-          <w:rFonts w:ascii="Calibri" w:hAnsi="Calibri" w:cs="Calibri"/>
-          <w:sz w:val="22"/>
-          <w:szCs w:val="22"/>
-        </w:rPr>
-      </w:pPr>
-    </w:p>
-    <w:p>
-      <w:pPr>
-        <w:jc w:val="both"/>
-        <w:rPr>
-          <w:rFonts w:ascii="Calibri" w:hAnsi="Calibri" w:cs="Calibri"/>
-          <w:sz w:val="22"/>
-          <w:szCs w:val="22"/>
-        </w:rPr>
-      </w:pPr>
-      <w:r>
-        <w:rPr>
-          <w:rFonts w:ascii="Calibri" w:hAnsi="Calibri" w:cs="Calibri"/>
-          <w:sz w:val="22"/>
-          <w:szCs w:val="22"/>
-        </w:rPr>
-        <w:t>Les Parties insistent sur le fait que le présent</w:t>
-      </w:r>
-      <w:r>
-        <w:rPr>
-          <w:rFonts w:ascii="Calibri" w:hAnsi="Calibri" w:cs="Calibri"/>
-          <w:sz w:val="22"/>
-          <w:szCs w:val="22"/>
-        </w:rPr>
-        <w:t xml:space="preserve"> Bail</w:t>
-      </w:r>
-      <w:r>
-        <w:rPr>
-          <w:rFonts w:ascii="Calibri" w:hAnsi="Calibri" w:cs="Calibri"/>
-          <w:sz w:val="22"/>
-          <w:szCs w:val="22"/>
-        </w:rPr>
-        <w:t xml:space="preserve"> a fait l’objet de discussions entre elles.</w:t>
-      </w:r>
-    </w:p>
-    <w:p>
-      <w:pPr>
-        <w:jc w:val="both"/>
-        <w:rPr>
-          <w:rFonts w:ascii="Calibri" w:hAnsi="Calibri" w:cs="Calibri"/>
-          <w:sz w:val="22"/>
-          <w:szCs w:val="22"/>
-        </w:rPr>
-      </w:pPr>
-    </w:p>
-    <w:p>
-      <w:pPr>
-        <w:jc w:val="both"/>
-        <w:rPr>
-          <w:rFonts w:ascii="Calibri" w:hAnsi="Calibri" w:cs="Calibri"/>
-          <w:sz w:val="22"/>
-          <w:szCs w:val="22"/>
-        </w:rPr>
-      </w:pPr>
-      <w:r>
-        <w:rPr>
-          <w:rFonts w:ascii="Calibri" w:hAnsi="Calibri" w:cs="Calibri"/>
-          <w:sz w:val="22"/>
-          <w:szCs w:val="22"/>
-        </w:rPr>
-        <w:t xml:space="preserve">C’est dans ces conditions que les Parties ont décidé, au moyen du présent article, de conférer à certaines stipulations du </w:t>
+        <w:t xml:space="preserve">En conséquence, il est expressément convenu entre les Parties que dans l'hypothèse où celle-ci ne serait plus l'exploitant des </w:t>
+      </w:r>
+      <w:r>
+        <w:rPr>
+          <w:rFonts w:ascii="Calibri" w:hAnsi="Calibri" w:cs="Calibri"/>
+          <w:sz w:val="22"/>
+          <w:szCs w:val="22"/>
+        </w:rPr>
+        <w:t>Locaux Loués</w:t>
+      </w:r>
+      <w:r>
+        <w:rPr>
+          <w:rFonts w:ascii="Calibri" w:hAnsi="Calibri" w:cs="Calibri"/>
+          <w:sz w:val="22"/>
+          <w:szCs w:val="22"/>
+        </w:rPr>
+        <w:t xml:space="preserve">, ou en cas de cession de quelque nature que ce soit, les dispositions du </w:t>
       </w:r>
       <w:r>
         <w:rPr>
@@ -26546,33 +26708,57 @@
           <w:sz w:val="22"/>
           <w:szCs w:val="22"/>
         </w:rPr>
-        <w:t>et ce, convention expresse entre elles un caractère « </w:t>
-      </w:r>
-      <w:r>
-        <w:rPr>
-          <w:rFonts w:ascii="Calibri" w:hAnsi="Calibri" w:cs="Calibri"/>
-          <w:i/>
-          <w:sz w:val="22"/>
-          <w:szCs w:val="22"/>
-        </w:rPr>
-        <w:t>intuitu personae</w:t>
-      </w:r>
-      <w:r>
-        <w:rPr>
-          <w:rFonts w:ascii="Calibri" w:hAnsi="Calibri" w:cs="Calibri"/>
-          <w:sz w:val="22"/>
-          <w:szCs w:val="22"/>
-        </w:rPr>
-        <w:t xml:space="preserve"> » au seul profit de la société </w:t>
-      </w:r>
-      <w:r>
-        <w:rPr>
-          <w:rFonts w:ascii="Calibri" w:hAnsi="Calibri" w:cs="Calibri"/>
-          <w:sz w:val="22"/>
-          <w:szCs w:val="22"/>
-          <w:highlight w:val="lightGray"/>
-        </w:rPr>
-        <w:t>XXX</w:t>
+        <w:t>reprendr</w:t>
+      </w:r>
+      <w:r>
+        <w:rPr>
+          <w:rFonts w:ascii="Calibri" w:hAnsi="Calibri" w:cs="Calibri"/>
+          <w:sz w:val="22"/>
+          <w:szCs w:val="22"/>
+        </w:rPr>
+        <w:t>o</w:t>
+      </w:r>
+      <w:r>
+        <w:rPr>
+          <w:rFonts w:ascii="Calibri" w:hAnsi="Calibri" w:cs="Calibri"/>
+          <w:sz w:val="22"/>
+          <w:szCs w:val="22"/>
+        </w:rPr>
+        <w:t>nt leur plein et entier effet</w:t>
+      </w:r>
+      <w:r>
+        <w:rPr>
+          <w:rFonts w:ascii="Calibri" w:hAnsi="Calibri" w:cs="Calibri"/>
+          <w:sz w:val="22"/>
+          <w:szCs w:val="22"/>
+        </w:rPr>
+        <w:t xml:space="preserve"> et que le présent </w:t>
+      </w:r>
+      <w:r>
+        <w:rPr>
+          <w:rFonts w:ascii="Calibri" w:hAnsi="Calibri" w:cs="Calibri"/>
+          <w:sz w:val="22"/>
+          <w:szCs w:val="22"/>
+          <w:highlight w:val="yellow"/>
+        </w:rPr>
+        <w:t>A</w:t>
+      </w:r>
+      <w:r>
+        <w:rPr>
+          <w:rFonts w:ascii="Calibri" w:hAnsi="Calibri" w:cs="Calibri"/>
+          <w:sz w:val="22"/>
+          <w:szCs w:val="22"/>
+          <w:highlight w:val="yellow"/>
+        </w:rPr>
+        <w:t xml:space="preserve">rticle </w:t>
+      </w:r>
+      <w:r>
+        <w:rPr>
+          <w:rFonts w:ascii="Calibri" w:hAnsi="Calibri" w:cs="Calibri"/>
+          <w:sz w:val="22"/>
+          <w:szCs w:val="22"/>
+        </w:rPr>
+        <w:t>deviendra nul et non avenu</w:t>
       </w:r>
       <w:r>
         <w:rPr>
@@ -26607,73 +26793,9 @@
           <w:rFonts w:ascii="Calibri" w:hAnsi="Calibri" w:cs="Calibri"/>
           <w:sz w:val="22"/>
           <w:szCs w:val="22"/>
-        </w:rPr>
-        <w:t xml:space="preserve">En conséquence, il est expressément convenu entre les Parties que dans l'hypothèse où celle-ci ne serait plus l'exploitant des </w:t>
-      </w:r>
-      <w:r>
-        <w:rPr>
-          <w:rFonts w:ascii="Calibri" w:hAnsi="Calibri" w:cs="Calibri"/>
-          <w:sz w:val="22"/>
-          <w:szCs w:val="22"/>
-        </w:rPr>
-        <w:t>Locaux Loués</w:t>
-      </w:r>
-      <w:r>
-        <w:rPr>
-          <w:rFonts w:ascii="Calibri" w:hAnsi="Calibri" w:cs="Calibri"/>
-          <w:sz w:val="22"/>
-          <w:szCs w:val="22"/>
-        </w:rPr>
-        <w:t xml:space="preserve">, ou en cas de cession de quelque nature que ce soit, les dispositions du </w:t>
-      </w:r>
-      <w:r>
-        <w:rPr>
-          <w:rFonts w:ascii="Calibri" w:hAnsi="Calibri" w:cs="Calibri"/>
-          <w:sz w:val="22"/>
-          <w:szCs w:val="22"/>
-        </w:rPr>
-        <w:t xml:space="preserve">Bail </w:t>
-      </w:r>
-      <w:r>
-        <w:rPr>
-          <w:rFonts w:ascii="Calibri" w:hAnsi="Calibri" w:cs="Calibri"/>
-          <w:sz w:val="22"/>
-          <w:szCs w:val="22"/>
-        </w:rPr>
-        <w:t>reprendr</w:t>
-      </w:r>
-      <w:r>
-        <w:rPr>
-          <w:rFonts w:ascii="Calibri" w:hAnsi="Calibri" w:cs="Calibri"/>
-          <w:sz w:val="22"/>
-          <w:szCs w:val="22"/>
-        </w:rPr>
-        <w:t>o</w:t>
-      </w:r>
-      <w:r>
-        <w:rPr>
-          <w:rFonts w:ascii="Calibri" w:hAnsi="Calibri" w:cs="Calibri"/>
-          <w:sz w:val="22"/>
-          <w:szCs w:val="22"/>
-        </w:rPr>
-        <w:t>nt leur plein et entier effet</w:t>
-      </w:r>
-      <w:r>
-        <w:rPr>
-          <w:rFonts w:ascii="Calibri" w:hAnsi="Calibri" w:cs="Calibri"/>
-          <w:sz w:val="22"/>
-          <w:szCs w:val="22"/>
-        </w:rPr>
-        <w:t xml:space="preserve"> et que le présent </w:t>
-      </w:r>
-      <w:r>
-        <w:rPr>
-          <w:rFonts w:ascii="Calibri" w:hAnsi="Calibri" w:cs="Calibri"/>
-          <w:sz w:val="22"/>
-          <w:szCs w:val="22"/>
           <w:highlight w:val="yellow"/>
         </w:rPr>
-        <w:t>A</w:t>
+        <w:t xml:space="preserve">Cela étant convenu, le </w:t>
       </w:r>
       <w:r>
         <w:rPr>
@@ -26682,44 +26804,8 @@
           <w:szCs w:val="22"/>
           <w:highlight w:val="yellow"/>
         </w:rPr>
-        <w:t xml:space="preserve">rticle </w:t>
-      </w:r>
-      <w:r>
-        <w:rPr>
-          <w:rFonts w:ascii="Calibri" w:hAnsi="Calibri" w:cs="Calibri"/>
-          <w:sz w:val="22"/>
-          <w:szCs w:val="22"/>
-        </w:rPr>
-        <w:t>deviendra nul et non avenu</w:t>
-      </w:r>
-      <w:r>
-        <w:rPr>
-          <w:rFonts w:ascii="Calibri" w:hAnsi="Calibri" w:cs="Calibri"/>
-          <w:sz w:val="22"/>
-          <w:szCs w:val="22"/>
-        </w:rPr>
-        <w:t>.</w:t>
-      </w:r>
-    </w:p>
-    <w:p>
-      <w:pPr>
-        <w:jc w:val="both"/>
-        <w:rPr>
-          <w:rFonts w:ascii="Calibri" w:hAnsi="Calibri" w:cs="Calibri"/>
-          <w:sz w:val="22"/>
-          <w:szCs w:val="22"/>
-        </w:rPr>
-      </w:pPr>
-    </w:p>
-    <w:p>
-      <w:pPr>
-        <w:jc w:val="both"/>
-        <w:rPr>
-          <w:rFonts w:ascii="Calibri" w:hAnsi="Calibri" w:cs="Calibri"/>
-          <w:sz w:val="22"/>
-          <w:szCs w:val="22"/>
-        </w:rPr>
-      </w:pPr>
+        <w:t xml:space="preserve">Bail est complété et/ou </w:t>
+      </w:r>
       <w:r>
         <w:rPr>
           <w:rFonts w:ascii="Calibri" w:hAnsi="Calibri" w:cs="Calibri"/>
@@ -26727,17 +26813,94 @@
           <w:szCs w:val="22"/>
           <w:highlight w:val="yellow"/>
         </w:rPr>
-        <w:t xml:space="preserve">Cela étant convenu, le </w:t>
-      </w:r>
-      <w:r>
+        <w:t>modifié par les stipulations suivantes :</w:t>
+      </w:r>
+      <w:r>
+        <w:rPr>
+          <w:rFonts w:ascii="Calibri" w:hAnsi="Calibri" w:cs="Calibri"/>
+          <w:sz w:val="22"/>
+          <w:szCs w:val="22"/>
+        </w:rPr>
+        <w:t xml:space="preserve"> </w:t>
+      </w:r>
+    </w:p>
+    <w:p>
+      <w:pPr>
+        <w:jc w:val="both"/>
+        <w:rPr>
+          <w:rFonts w:ascii="Calibri" w:hAnsi="Calibri" w:cs="Calibri"/>
+          <w:sz w:val="22"/>
+          <w:szCs w:val="22"/>
+        </w:rPr>
+      </w:pPr>
+    </w:p>
+    <w:p>
+      <w:r>
+        <w:t>{{ARTICLE_26_1}}</w:t>
+      </w:r>
+    </w:p>
+    <w:p/>
+    <w:p>
+      <w:r>
+        <w:t>{{ARTICLE_26_2}}</w:t>
+      </w:r>
+    </w:p>
+    <w:p>
+      <w:pPr>
+        <w:jc w:val="both"/>
+        <w:rPr>
+          <w:rFonts w:ascii="Calibri" w:hAnsi="Calibri" w:cs="Calibri"/>
+          <w:sz w:val="22"/>
+          <w:szCs w:val="22"/>
+        </w:rPr>
+      </w:pPr>
+    </w:p>
+    <w:p>
+      <w:pPr>
+        <w:jc w:val="both"/>
+        <w:rPr>
+          <w:rFonts w:ascii="Calibri" w:hAnsi="Calibri" w:cs="Calibri"/>
+          <w:sz w:val="22"/>
+          <w:szCs w:val="22"/>
+        </w:rPr>
+      </w:pPr>
+    </w:p>
+    <w:p>
+      <w:pPr>
+        <w:pStyle w:val="Titre2"/>
+      </w:pPr>
+      <w:bookmarkStart w:id="68" w:name="_Toc176798898"/>
+      <w:r>
+        <w:t xml:space="preserve">ARTICLE </w:t>
+      </w:r>
+      <w:r>
+        <w:t>27</w:t>
+      </w:r>
+      <w:r>
+        <w:t xml:space="preserve"> – SIGNATURE ELECTRONIQUE</w:t>
+      </w:r>
+      <w:bookmarkEnd w:id="68"/>
+    </w:p>
+    <w:p>
+      <w:pPr>
+        <w:jc w:val="both"/>
         <w:rPr>
           <w:rFonts w:ascii="Calibri" w:hAnsi="Calibri" w:cs="Calibri"/>
           <w:sz w:val="22"/>
           <w:szCs w:val="22"/>
           <w:highlight w:val="yellow"/>
         </w:rPr>
-        <w:t xml:space="preserve">Bail est complété et/ou </w:t>
-      </w:r>
+      </w:pPr>
+    </w:p>
+    <w:p>
+      <w:pPr>
+        <w:jc w:val="both"/>
+        <w:rPr>
+          <w:rFonts w:ascii="Calibri" w:hAnsi="Calibri" w:cs="Calibri"/>
+          <w:sz w:val="22"/>
+          <w:szCs w:val="22"/>
+        </w:rPr>
+      </w:pPr>
       <w:r>
         <w:rPr>
           <w:rFonts w:ascii="Calibri" w:hAnsi="Calibri" w:cs="Calibri"/>
@@ -26745,163 +26908,8 @@
           <w:szCs w:val="22"/>
           <w:highlight w:val="yellow"/>
         </w:rPr>
-        <w:t>modifié par les stipulations suivantes :</w:t>
-      </w:r>
-      <w:r>
-        <w:rPr>
-          <w:rFonts w:ascii="Calibri" w:hAnsi="Calibri" w:cs="Calibri"/>
-          <w:sz w:val="22"/>
-          <w:szCs w:val="22"/>
-        </w:rPr>
-        <w:t xml:space="preserve"> </w:t>
-      </w:r>
-    </w:p>
-    <w:p>
-      <w:pPr>
-        <w:jc w:val="both"/>
-        <w:rPr>
-          <w:rFonts w:ascii="Calibri" w:hAnsi="Calibri" w:cs="Calibri"/>
-          <w:sz w:val="22"/>
-          <w:szCs w:val="22"/>
-        </w:rPr>
-      </w:pPr>
-    </w:p>
-    <w:p>
-      <w:r>
-        <w:t>{{ARTICLE_26_1}}</w:t>
-      </w:r>
-    </w:p>
-    <w:p/>
-    <w:p>
-      <w:r>
-        <w:t>{{ARTICLE_26_2}}</w:t>
-      </w:r>
-    </w:p>
-    <w:p>
-      <w:pPr>
-        <w:jc w:val="both"/>
-        <w:rPr>
-          <w:rFonts w:ascii="Calibri" w:hAnsi="Calibri" w:cs="Calibri"/>
-          <w:sz w:val="22"/>
-          <w:szCs w:val="22"/>
-        </w:rPr>
-      </w:pPr>
-    </w:p>
-    <w:p>
-      <w:pPr>
-        <w:jc w:val="both"/>
-        <w:rPr>
-          <w:rFonts w:ascii="Calibri" w:hAnsi="Calibri" w:cs="Calibri"/>
-          <w:sz w:val="22"/>
-          <w:szCs w:val="22"/>
-        </w:rPr>
-      </w:pPr>
-    </w:p>
-    <w:p>
-      <w:pPr>
-        <w:pStyle w:val="Titre2"/>
-      </w:pPr>
-      <w:bookmarkStart w:id="68" w:name="_Toc176798898"/>
-      <w:r>
-        <w:t xml:space="preserve">ARTICLE </w:t>
-      </w:r>
-      <w:r>
-        <w:t>27</w:t>
-      </w:r>
-      <w:r>
-        <w:t xml:space="preserve"> – SIGNATURE ELECTRONIQUE</w:t>
-      </w:r>
-      <w:bookmarkEnd w:id="68"/>
-    </w:p>
-    <w:p>
-      <w:pPr>
-        <w:jc w:val="both"/>
-        <w:rPr>
-          <w:rFonts w:ascii="Calibri" w:hAnsi="Calibri" w:cs="Calibri"/>
-          <w:sz w:val="22"/>
-          <w:szCs w:val="22"/>
-          <w:highlight w:val="yellow"/>
-        </w:rPr>
-      </w:pPr>
-    </w:p>
-    <w:p>
-      <w:pPr>
-        <w:jc w:val="both"/>
-        <w:rPr>
-          <w:rFonts w:ascii="Calibri" w:hAnsi="Calibri" w:cs="Calibri"/>
-          <w:sz w:val="22"/>
-          <w:szCs w:val="22"/>
-        </w:rPr>
-      </w:pPr>
-      <w:r>
-        <w:rPr>
-          <w:rFonts w:ascii="Calibri" w:hAnsi="Calibri" w:cs="Calibri"/>
-          <w:sz w:val="22"/>
-          <w:szCs w:val="22"/>
-          <w:highlight w:val="yellow"/>
-        </w:rPr>
         <w:t>Conformément aux articles 1367 et 1368 du Code civil, les Parties conviennent que chacune d’elle pourra signer le présent bail par voie électronique, y compris par l’apposition d’une signature électronique générée par DocuSign ou par tout autre service équivalent et reconnait que cette signature électronique aura la même valeur légale qu’une signature manuscrite.</w:t>
       </w:r>
-    </w:p>
-    <w:p>
-      <w:pPr>
-        <w:jc w:val="both"/>
-        <w:rPr>
-          <w:rFonts w:ascii="Calibri" w:hAnsi="Calibri" w:cs="Calibri"/>
-          <w:sz w:val="22"/>
-          <w:szCs w:val="22"/>
-        </w:rPr>
-      </w:pPr>
-    </w:p>
-    <w:p>
-      <w:pPr>
-        <w:jc w:val="both"/>
-        <w:rPr>
-          <w:rFonts w:ascii="Calibri" w:hAnsi="Calibri" w:cs="Calibri"/>
-          <w:sz w:val="22"/>
-          <w:szCs w:val="22"/>
-        </w:rPr>
-      </w:pPr>
-    </w:p>
-    <w:p>
-      <w:pPr>
-        <w:jc w:val="both"/>
-        <w:rPr>
-          <w:rFonts w:ascii="Calibri" w:hAnsi="Calibri" w:cs="Calibri"/>
-          <w:sz w:val="22"/>
-          <w:szCs w:val="22"/>
-        </w:rPr>
-      </w:pPr>
-    </w:p>
-    <w:p>
-      <w:pPr>
-        <w:jc w:val="both"/>
-        <w:rPr>
-          <w:rFonts w:ascii="Calibri" w:hAnsi="Calibri" w:cs="Calibri"/>
-          <w:sz w:val="22"/>
-          <w:szCs w:val="22"/>
-        </w:rPr>
-      </w:pPr>
-    </w:p>
-    <w:p>
-      <w:pPr>
-        <w:jc w:val="both"/>
-        <w:rPr>
-          <w:rFonts w:ascii="Calibri" w:hAnsi="Calibri" w:cs="Calibri"/>
-          <w:sz w:val="22"/>
-          <w:szCs w:val="22"/>
-        </w:rPr>
-      </w:pPr>
-    </w:p>
-    <w:p>
-      <w:pPr>
-        <w:jc w:val="both"/>
-        <w:rPr>
-          <w:rFonts w:ascii="Calibri" w:hAnsi="Calibri" w:cs="Calibri"/>
-          <w:sz w:val="22"/>
-          <w:szCs w:val="22"/>
-        </w:rPr>
-      </w:pPr>
     </w:p>
     <w:p>
       <w:pPr>
@@ -27338,7 +27346,6 @@
           <w:sz w:val="22"/>
           <w:szCs w:val="22"/>
         </w:rPr>
-        <w:lastRenderedPageBreak/>
         <w:t>Livret de sensibilisation preneur aux</w:t>
       </w:r>
       <w:r>
@@ -33478,15 +33485,6 @@
   </w:num>
   <w:num w:numId="27" w16cid:durableId="1231575430">
     <w:abstractNumId w:val="39"/>
-    <w:lvlOverride w:ilvl="0"/>
-    <w:lvlOverride w:ilvl="1"/>
-    <w:lvlOverride w:ilvl="2"/>
-    <w:lvlOverride w:ilvl="3"/>
-    <w:lvlOverride w:ilvl="4"/>
-    <w:lvlOverride w:ilvl="5"/>
-    <w:lvlOverride w:ilvl="6"/>
-    <w:lvlOverride w:ilvl="7"/>
-    <w:lvlOverride w:ilvl="8"/>
   </w:num>
   <w:num w:numId="28" w16cid:durableId="677854266">
     <w:abstractNumId w:val="40"/>
@@ -34125,7 +34123,9 @@
   </w:style>
   <w:style w:type="character" w:default="1" w:styleId="Policepardfaut">
     <w:name w:val="Default Paragraph Font"/>
+    <w:uiPriority w:val="1"/>
     <w:semiHidden/>
+    <w:unhideWhenUsed/>
   </w:style>
   <w:style w:type="table" w:default="1" w:styleId="TableauNormal">
     <w:name w:val="Normal Table"/>
@@ -34469,7 +34469,7 @@
     </w:rPr>
   </w:style>
   <w:style w:type="paragraph" w:customStyle="1" w:styleId="Car">
-    <w:name w:val=" Car"/>
+    <w:name w:val="Car"/>
     <w:basedOn w:val="Normal"/>
     <w:rsid w:val="00C2298E"/>
     <w:rPr>
@@ -35080,6 +35080,10 @@
 </file>
 
 <file path=customXml/item1.xml><?xml version="1.0" encoding="utf-8"?>
+<LongProperties xmlns="http://schemas.microsoft.com/office/2006/metadata/longProperties"/>
+</file>
+
+<file path=customXml/item2.xml><?xml version="1.0" encoding="utf-8"?>
 <ct:contentTypeSchema xmlns:ct="http://schemas.microsoft.com/office/2006/metadata/contentType" xmlns:ma="http://schemas.microsoft.com/office/2006/metadata/properties/metaAttributes" ct:_="" ma:_="" ma:contentTypeName="Document" ma:contentTypeID="0x010100C1477335BF24C648BA53D479DA4A61BD" ma:contentTypeVersion="14" ma:contentTypeDescription="Crée un document." ma:contentTypeScope="" ma:versionID="180c3fc76efa0ed238368edeb6deee88">
   <xsd:schema xmlns:xsd="http://www.w3.org/2001/XMLSchema" xmlns:xs="http://www.w3.org/2001/XMLSchema" xmlns:p="http://schemas.microsoft.com/office/2006/metadata/properties" xmlns:ns2="ab1295a0-2bcf-4676-95df-08d3673ed964" xmlns:ns3="5de3e35e-e990-4739-b9f9-e4dc4e353ff4" targetNamespace="http://schemas.microsoft.com/office/2006/metadata/properties" ma:root="true" ma:fieldsID="479566ac2cb28e4015da3201cbe1e3bd" ns2:_="" ns3:_="">
     <xsd:import namespace="ab1295a0-2bcf-4676-95df-08d3673ed964"/>
@@ -35292,11 +35296,11 @@
 </ct:contentTypeSchema>
 </file>
 
-<file path=customXml/item2.xml><?xml version="1.0" encoding="utf-8"?>
-<LongProperties xmlns="http://schemas.microsoft.com/office/2006/metadata/longProperties"/>
+<file path=customXml/item3.xml><?xml version="1.0" encoding="utf-8"?>
+<b:Sources xmlns:b="http://schemas.openxmlformats.org/officeDocument/2006/bibliography" xmlns="http://schemas.openxmlformats.org/officeDocument/2006/bibliography" SelectedStyle="\APASixthEditionOfficeOnline.xsl" StyleName="APA" Version="6"/>
 </file>
 
-<file path=customXml/item3.xml><?xml version="1.0" encoding="utf-8"?>
+<file path=customXml/item4.xml><?xml version="1.0" encoding="utf-8"?>
 <?mso-contentType ?>
 <FormTemplates xmlns="http://schemas.microsoft.com/sharepoint/v3/contenttype/forms">
   <Display>DocumentLibraryForm</Display>
@@ -35305,11 +35309,15 @@
 </FormTemplates>
 </file>
 
-<file path=customXml/item4.xml><?xml version="1.0" encoding="utf-8"?>
-<b:Sources xmlns:b="http://schemas.openxmlformats.org/officeDocument/2006/bibliography" xmlns="http://schemas.openxmlformats.org/officeDocument/2006/bibliography" SelectedStyle="\APASixthEditionOfficeOnline.xsl" StyleName="APA" Version="6"/>
+<file path=customXml/itemProps1.xml><?xml version="1.0" encoding="utf-8"?>
+<ds:datastoreItem xmlns:ds="http://schemas.openxmlformats.org/officeDocument/2006/customXml" ds:itemID="{C44360D9-B12A-4AA2-BD22-505D8495151D}">
+  <ds:schemaRefs>
+    <ds:schemaRef ds:uri="http://schemas.microsoft.com/office/2006/metadata/longProperties"/>
+  </ds:schemaRefs>
+</ds:datastoreItem>
 </file>
 
-<file path=customXml/itemProps1.xml><?xml version="1.0" encoding="utf-8"?>
+<file path=customXml/itemProps2.xml><?xml version="1.0" encoding="utf-8"?>
 <ds:datastoreItem xmlns:ds="http://schemas.openxmlformats.org/officeDocument/2006/customXml" ds:itemID="{5A39B851-05C2-4B47-ACB8-52010745A183}">
   <ds:schemaRefs>
     <ds:schemaRef ds:uri="http://schemas.microsoft.com/office/2006/metadata/contentType"/>
@@ -35328,26 +35336,18 @@
 </ds:datastoreItem>
 </file>
 
-<file path=customXml/itemProps2.xml><?xml version="1.0" encoding="utf-8"?>
-<ds:datastoreItem xmlns:ds="http://schemas.openxmlformats.org/officeDocument/2006/customXml" ds:itemID="{C44360D9-B12A-4AA2-BD22-505D8495151D}">
+<file path=customXml/itemProps3.xml><?xml version="1.0" encoding="utf-8"?>
+<ds:datastoreItem xmlns:ds="http://schemas.openxmlformats.org/officeDocument/2006/customXml" ds:itemID="{4806BBF5-2B89-4EC2-B9C9-942CA5E3F446}">
   <ds:schemaRefs>
-    <ds:schemaRef ds:uri="http://schemas.microsoft.com/office/2006/metadata/longProperties"/>
+    <ds:schemaRef ds:uri="http://schemas.openxmlformats.org/officeDocument/2006/bibliography"/>
   </ds:schemaRefs>
 </ds:datastoreItem>
 </file>
 
-<file path=customXml/itemProps3.xml><?xml version="1.0" encoding="utf-8"?>
+<file path=customXml/itemProps4.xml><?xml version="1.0" encoding="utf-8"?>
 <ds:datastoreItem xmlns:ds="http://schemas.openxmlformats.org/officeDocument/2006/customXml" ds:itemID="{10A917DD-52E6-41E9-8B96-81582FA04C05}">
   <ds:schemaRefs>
     <ds:schemaRef ds:uri="http://schemas.microsoft.com/sharepoint/v3/contenttype/forms"/>
   </ds:schemaRefs>
 </ds:datastoreItem>
-</file>
-
-<file path=customXml/itemProps4.xml><?xml version="1.0" encoding="utf-8"?>
-<ds:datastoreItem xmlns:ds="http://schemas.openxmlformats.org/officeDocument/2006/customXml" ds:itemID="{4806BBF5-2B89-4EC2-B9C9-942CA5E3F446}">
-  <ds:schemaRefs>
-    <ds:schemaRef ds:uri="http://schemas.openxmlformats.org/officeDocument/2006/bibliography"/>
-  </ds:schemaRefs>
-</ds:datastoreItem>
 </file>
</xml_diff>